<commit_message>
docs: finalize report review and prepare presentation demo
</commit_message>
<xml_diff>
--- a/Laporan Big Data Analytics - 2702751284.docx
+++ b/Laporan Big Data Analytics - 2702751284.docx
@@ -590,7 +590,7 @@
       <w:r>
         <w:fldChar w:fldCharType="separate"/>
       </w:r>
-      <w:hyperlink w:anchor="_Toc241501770" w:history="1">
+      <w:hyperlink w:anchor="_Toc241504576" w:history="1">
         <w:r>
           <w:rPr>
             <w:rStyle w:val="Hyperlink"/>
@@ -617,7 +617,7 @@
             <w:noProof/>
             <w:webHidden/>
           </w:rPr>
-          <w:instrText xml:space="preserve"> PAGEREF _Toc241501770 \h </w:instrText>
+          <w:instrText xml:space="preserve"> PAGEREF _Toc241504576 \h </w:instrText>
         </w:r>
         <w:r>
           <w:rPr>
@@ -665,7 +665,7 @@
           <w14:ligatures w14:val="standardContextual"/>
         </w:rPr>
       </w:pPr>
-      <w:hyperlink w:anchor="_Toc241501771" w:history="1">
+      <w:hyperlink w:anchor="_Toc241504577" w:history="1">
         <w:r>
           <w:rPr>
             <w:rStyle w:val="Hyperlink"/>
@@ -693,7 +693,7 @@
             <w:noProof/>
             <w:webHidden/>
           </w:rPr>
-          <w:instrText xml:space="preserve"> PAGEREF _Toc241501771 \h </w:instrText>
+          <w:instrText xml:space="preserve"> PAGEREF _Toc241504577 \h </w:instrText>
         </w:r>
         <w:r>
           <w:rPr>
@@ -741,7 +741,7 @@
           <w14:ligatures w14:val="standardContextual"/>
         </w:rPr>
       </w:pPr>
-      <w:hyperlink w:anchor="_Toc241501772" w:history="1">
+      <w:hyperlink w:anchor="_Toc241504578" w:history="1">
         <w:r>
           <w:rPr>
             <w:rStyle w:val="Hyperlink"/>
@@ -794,7 +794,7 @@
             <w:noProof/>
             <w:webHidden/>
           </w:rPr>
-          <w:instrText xml:space="preserve"> PAGEREF _Toc241501772 \h </w:instrText>
+          <w:instrText xml:space="preserve"> PAGEREF _Toc241504578 \h </w:instrText>
         </w:r>
         <w:r>
           <w:rPr>
@@ -814,7 +814,7 @@
             <w:noProof/>
             <w:webHidden/>
           </w:rPr>
-          <w:t>3</w:t>
+          <w:t>4</w:t>
         </w:r>
         <w:r>
           <w:rPr>
@@ -842,7 +842,7 @@
           <w14:ligatures w14:val="standardContextual"/>
         </w:rPr>
       </w:pPr>
-      <w:hyperlink w:anchor="_Toc241501773" w:history="1">
+      <w:hyperlink w:anchor="_Toc241504579" w:history="1">
         <w:r>
           <w:rPr>
             <w:rStyle w:val="Hyperlink"/>
@@ -877,7 +877,7 @@
             <w:noProof/>
             <w:webHidden/>
           </w:rPr>
-          <w:instrText xml:space="preserve"> PAGEREF _Toc241501773 \h </w:instrText>
+          <w:instrText xml:space="preserve"> PAGEREF _Toc241504579 \h </w:instrText>
         </w:r>
         <w:r>
           <w:rPr>
@@ -897,7 +897,7 @@
             <w:noProof/>
             <w:webHidden/>
           </w:rPr>
-          <w:t>4</w:t>
+          <w:t>5</w:t>
         </w:r>
         <w:r>
           <w:rPr>
@@ -922,7 +922,7 @@
           <w14:ligatures w14:val="standardContextual"/>
         </w:rPr>
       </w:pPr>
-      <w:hyperlink w:anchor="_Toc241501774" w:history="1">
+      <w:hyperlink w:anchor="_Toc241504580" w:history="1">
         <w:r>
           <w:rPr>
             <w:rStyle w:val="Hyperlink"/>
@@ -949,7 +949,7 @@
             <w:noProof/>
             <w:webHidden/>
           </w:rPr>
-          <w:instrText xml:space="preserve"> PAGEREF _Toc241501774 \h </w:instrText>
+          <w:instrText xml:space="preserve"> PAGEREF _Toc241504580 \h </w:instrText>
         </w:r>
         <w:r>
           <w:rPr>
@@ -969,7 +969,7 @@
             <w:noProof/>
             <w:webHidden/>
           </w:rPr>
-          <w:t>5</w:t>
+          <w:t>6</w:t>
         </w:r>
         <w:r>
           <w:rPr>
@@ -997,7 +997,7 @@
           <w14:ligatures w14:val="standardContextual"/>
         </w:rPr>
       </w:pPr>
-      <w:hyperlink w:anchor="_Toc241501775" w:history="1">
+      <w:hyperlink w:anchor="_Toc241504581" w:history="1">
         <w:r>
           <w:rPr>
             <w:rStyle w:val="Hyperlink"/>
@@ -1032,7 +1032,7 @@
             <w:noProof/>
             <w:webHidden/>
           </w:rPr>
-          <w:instrText xml:space="preserve"> PAGEREF _Toc241501775 \h </w:instrText>
+          <w:instrText xml:space="preserve"> PAGEREF _Toc241504581 \h </w:instrText>
         </w:r>
         <w:r>
           <w:rPr>
@@ -1052,7 +1052,7 @@
             <w:noProof/>
             <w:webHidden/>
           </w:rPr>
-          <w:t>5</w:t>
+          <w:t>6</w:t>
         </w:r>
         <w:r>
           <w:rPr>
@@ -1080,7 +1080,7 @@
           <w14:ligatures w14:val="standardContextual"/>
         </w:rPr>
       </w:pPr>
-      <w:hyperlink w:anchor="_Toc241501776" w:history="1">
+      <w:hyperlink w:anchor="_Toc241504582" w:history="1">
         <w:r>
           <w:rPr>
             <w:rStyle w:val="Hyperlink"/>
@@ -1115,7 +1115,7 @@
             <w:noProof/>
             <w:webHidden/>
           </w:rPr>
-          <w:instrText xml:space="preserve"> PAGEREF _Toc241501776 \h </w:instrText>
+          <w:instrText xml:space="preserve"> PAGEREF _Toc241504582 \h </w:instrText>
         </w:r>
         <w:r>
           <w:rPr>
@@ -1135,7 +1135,7 @@
             <w:noProof/>
             <w:webHidden/>
           </w:rPr>
-          <w:t>5</w:t>
+          <w:t>6</w:t>
         </w:r>
         <w:r>
           <w:rPr>
@@ -1163,7 +1163,7 @@
           <w14:ligatures w14:val="standardContextual"/>
         </w:rPr>
       </w:pPr>
-      <w:hyperlink w:anchor="_Toc241501777" w:history="1">
+      <w:hyperlink w:anchor="_Toc241504583" w:history="1">
         <w:r>
           <w:rPr>
             <w:rStyle w:val="Hyperlink"/>
@@ -1193,7 +1193,7 @@
             <w:noProof/>
             <w:webHidden/>
           </w:rPr>
-          <w:instrText xml:space="preserve"> PAGEREF _Toc241501777 \h </w:instrText>
+          <w:instrText xml:space="preserve"> PAGEREF _Toc241504583 \h </w:instrText>
         </w:r>
         <w:r>
           <w:rPr>
@@ -1213,7 +1213,7 @@
             <w:noProof/>
             <w:webHidden/>
           </w:rPr>
-          <w:t>5</w:t>
+          <w:t>6</w:t>
         </w:r>
         <w:r>
           <w:rPr>
@@ -1241,7 +1241,7 @@
           <w14:ligatures w14:val="standardContextual"/>
         </w:rPr>
       </w:pPr>
-      <w:hyperlink w:anchor="_Toc241501778" w:history="1">
+      <w:hyperlink w:anchor="_Toc241504584" w:history="1">
         <w:r>
           <w:rPr>
             <w:rStyle w:val="Hyperlink"/>
@@ -1271,7 +1271,7 @@
             <w:noProof/>
             <w:webHidden/>
           </w:rPr>
-          <w:instrText xml:space="preserve"> PAGEREF _Toc241501778 \h </w:instrText>
+          <w:instrText xml:space="preserve"> PAGEREF _Toc241504584 \h </w:instrText>
         </w:r>
         <w:r>
           <w:rPr>
@@ -1291,7 +1291,7 @@
             <w:noProof/>
             <w:webHidden/>
           </w:rPr>
-          <w:t>6</w:t>
+          <w:t>7</w:t>
         </w:r>
         <w:r>
           <w:rPr>
@@ -1319,7 +1319,7 @@
           <w14:ligatures w14:val="standardContextual"/>
         </w:rPr>
       </w:pPr>
-      <w:hyperlink w:anchor="_Toc241501779" w:history="1">
+      <w:hyperlink w:anchor="_Toc241504585" w:history="1">
         <w:r>
           <w:rPr>
             <w:rStyle w:val="Hyperlink"/>
@@ -1349,7 +1349,7 @@
             <w:noProof/>
             <w:webHidden/>
           </w:rPr>
-          <w:instrText xml:space="preserve"> PAGEREF _Toc241501779 \h </w:instrText>
+          <w:instrText xml:space="preserve"> PAGEREF _Toc241504585 \h </w:instrText>
         </w:r>
         <w:r>
           <w:rPr>
@@ -1369,7 +1369,7 @@
             <w:noProof/>
             <w:webHidden/>
           </w:rPr>
-          <w:t>7</w:t>
+          <w:t>8</w:t>
         </w:r>
         <w:r>
           <w:rPr>
@@ -1397,7 +1397,7 @@
           <w14:ligatures w14:val="standardContextual"/>
         </w:rPr>
       </w:pPr>
-      <w:hyperlink w:anchor="_Toc241501780" w:history="1">
+      <w:hyperlink w:anchor="_Toc241504586" w:history="1">
         <w:r>
           <w:rPr>
             <w:rStyle w:val="Hyperlink"/>
@@ -1424,7 +1424,7 @@
             <w:noProof/>
             <w:webHidden/>
           </w:rPr>
-          <w:instrText xml:space="preserve"> PAGEREF _Toc241501780 \h </w:instrText>
+          <w:instrText xml:space="preserve"> PAGEREF _Toc241504586 \h </w:instrText>
         </w:r>
         <w:r>
           <w:rPr>
@@ -1444,7 +1444,7 @@
             <w:noProof/>
             <w:webHidden/>
           </w:rPr>
-          <w:t>7</w:t>
+          <w:t>8</w:t>
         </w:r>
         <w:r>
           <w:rPr>
@@ -1472,7 +1472,7 @@
           <w14:ligatures w14:val="standardContextual"/>
         </w:rPr>
       </w:pPr>
-      <w:hyperlink w:anchor="_Toc241501781" w:history="1">
+      <w:hyperlink w:anchor="_Toc241504587" w:history="1">
         <w:r>
           <w:rPr>
             <w:rStyle w:val="Hyperlink"/>
@@ -1509,7 +1509,7 @@
             <w:noProof/>
             <w:webHidden/>
           </w:rPr>
-          <w:instrText xml:space="preserve"> PAGEREF _Toc241501781 \h </w:instrText>
+          <w:instrText xml:space="preserve"> PAGEREF _Toc241504587 \h </w:instrText>
         </w:r>
         <w:r>
           <w:rPr>
@@ -1529,7 +1529,7 @@
             <w:noProof/>
             <w:webHidden/>
           </w:rPr>
-          <w:t>7</w:t>
+          <w:t>8</w:t>
         </w:r>
         <w:r>
           <w:rPr>
@@ -1557,7 +1557,7 @@
           <w14:ligatures w14:val="standardContextual"/>
         </w:rPr>
       </w:pPr>
-      <w:hyperlink w:anchor="_Toc241501782" w:history="1">
+      <w:hyperlink w:anchor="_Toc241504588" w:history="1">
         <w:r>
           <w:rPr>
             <w:rStyle w:val="Hyperlink"/>
@@ -1584,7 +1584,7 @@
             <w:noProof/>
             <w:webHidden/>
           </w:rPr>
-          <w:instrText xml:space="preserve"> PAGEREF _Toc241501782 \h </w:instrText>
+          <w:instrText xml:space="preserve"> PAGEREF _Toc241504588 \h </w:instrText>
         </w:r>
         <w:r>
           <w:rPr>
@@ -1604,7 +1604,7 @@
             <w:noProof/>
             <w:webHidden/>
           </w:rPr>
-          <w:t>7</w:t>
+          <w:t>8</w:t>
         </w:r>
         <w:r>
           <w:rPr>
@@ -1632,7 +1632,7 @@
           <w14:ligatures w14:val="standardContextual"/>
         </w:rPr>
       </w:pPr>
-      <w:hyperlink w:anchor="_Toc241501783" w:history="1">
+      <w:hyperlink w:anchor="_Toc241504589" w:history="1">
         <w:r>
           <w:rPr>
             <w:rStyle w:val="Hyperlink"/>
@@ -1662,7 +1662,7 @@
             <w:noProof/>
             <w:webHidden/>
           </w:rPr>
-          <w:instrText xml:space="preserve"> PAGEREF _Toc241501783 \h </w:instrText>
+          <w:instrText xml:space="preserve"> PAGEREF _Toc241504589 \h </w:instrText>
         </w:r>
         <w:r>
           <w:rPr>
@@ -1682,7 +1682,7 @@
             <w:noProof/>
             <w:webHidden/>
           </w:rPr>
-          <w:t>8</w:t>
+          <w:t>9</w:t>
         </w:r>
         <w:r>
           <w:rPr>
@@ -1710,7 +1710,7 @@
           <w14:ligatures w14:val="standardContextual"/>
         </w:rPr>
       </w:pPr>
-      <w:hyperlink w:anchor="_Toc241501784" w:history="1">
+      <w:hyperlink w:anchor="_Toc241504590" w:history="1">
         <w:r>
           <w:rPr>
             <w:rStyle w:val="Hyperlink"/>
@@ -1737,7 +1737,7 @@
             <w:noProof/>
             <w:webHidden/>
           </w:rPr>
-          <w:instrText xml:space="preserve"> PAGEREF _Toc241501784 \h </w:instrText>
+          <w:instrText xml:space="preserve"> PAGEREF _Toc241504590 \h </w:instrText>
         </w:r>
         <w:r>
           <w:rPr>
@@ -1757,7 +1757,7 @@
             <w:noProof/>
             <w:webHidden/>
           </w:rPr>
-          <w:t>9</w:t>
+          <w:t>10</w:t>
         </w:r>
         <w:r>
           <w:rPr>
@@ -1782,7 +1782,7 @@
           <w14:ligatures w14:val="standardContextual"/>
         </w:rPr>
       </w:pPr>
-      <w:hyperlink w:anchor="_Toc241501785" w:history="1">
+      <w:hyperlink w:anchor="_Toc241504591" w:history="1">
         <w:r>
           <w:rPr>
             <w:rStyle w:val="Hyperlink"/>
@@ -1809,7 +1809,7 @@
             <w:noProof/>
             <w:webHidden/>
           </w:rPr>
-          <w:instrText xml:space="preserve"> PAGEREF _Toc241501785 \h </w:instrText>
+          <w:instrText xml:space="preserve"> PAGEREF _Toc241504591 \h </w:instrText>
         </w:r>
         <w:r>
           <w:rPr>
@@ -1829,7 +1829,7 @@
             <w:noProof/>
             <w:webHidden/>
           </w:rPr>
-          <w:t>10</w:t>
+          <w:t>11</w:t>
         </w:r>
         <w:r>
           <w:rPr>
@@ -1857,7 +1857,7 @@
           <w14:ligatures w14:val="standardContextual"/>
         </w:rPr>
       </w:pPr>
-      <w:hyperlink w:anchor="_Toc241501786" w:history="1">
+      <w:hyperlink w:anchor="_Toc241504592" w:history="1">
         <w:r>
           <w:rPr>
             <w:rStyle w:val="Hyperlink"/>
@@ -1901,7 +1901,7 @@
             <w:noProof/>
             <w:webHidden/>
           </w:rPr>
-          <w:instrText xml:space="preserve"> PAGEREF _Toc241501786 \h </w:instrText>
+          <w:instrText xml:space="preserve"> PAGEREF _Toc241504592 \h </w:instrText>
         </w:r>
         <w:r>
           <w:rPr>
@@ -1921,7 +1921,7 @@
             <w:noProof/>
             <w:webHidden/>
           </w:rPr>
-          <w:t>10</w:t>
+          <w:t>11</w:t>
         </w:r>
         <w:r>
           <w:rPr>
@@ -1949,7 +1949,7 @@
           <w14:ligatures w14:val="standardContextual"/>
         </w:rPr>
       </w:pPr>
-      <w:hyperlink w:anchor="_Toc241501787" w:history="1">
+      <w:hyperlink w:anchor="_Toc241504593" w:history="1">
         <w:r>
           <w:rPr>
             <w:rStyle w:val="Hyperlink"/>
@@ -1993,7 +1993,7 @@
             <w:noProof/>
             <w:webHidden/>
           </w:rPr>
-          <w:instrText xml:space="preserve"> PAGEREF _Toc241501787 \h </w:instrText>
+          <w:instrText xml:space="preserve"> PAGEREF _Toc241504593 \h </w:instrText>
         </w:r>
         <w:r>
           <w:rPr>
@@ -2013,7 +2013,7 @@
             <w:noProof/>
             <w:webHidden/>
           </w:rPr>
-          <w:t>10</w:t>
+          <w:t>11</w:t>
         </w:r>
         <w:r>
           <w:rPr>
@@ -2041,7 +2041,7 @@
           <w14:ligatures w14:val="standardContextual"/>
         </w:rPr>
       </w:pPr>
-      <w:hyperlink w:anchor="_Toc241501788" w:history="1">
+      <w:hyperlink w:anchor="_Toc241504594" w:history="1">
         <w:r>
           <w:rPr>
             <w:rStyle w:val="Hyperlink"/>
@@ -2068,7 +2068,7 @@
             <w:noProof/>
             <w:webHidden/>
           </w:rPr>
-          <w:instrText xml:space="preserve"> PAGEREF _Toc241501788 \h </w:instrText>
+          <w:instrText xml:space="preserve"> PAGEREF _Toc241504594 \h </w:instrText>
         </w:r>
         <w:r>
           <w:rPr>
@@ -2088,7 +2088,7 @@
             <w:noProof/>
             <w:webHidden/>
           </w:rPr>
-          <w:t>10</w:t>
+          <w:t>11</w:t>
         </w:r>
         <w:r>
           <w:rPr>
@@ -2116,7 +2116,7 @@
           <w14:ligatures w14:val="standardContextual"/>
         </w:rPr>
       </w:pPr>
-      <w:hyperlink w:anchor="_Toc241501789" w:history="1">
+      <w:hyperlink w:anchor="_Toc241504595" w:history="1">
         <w:r>
           <w:rPr>
             <w:rStyle w:val="Hyperlink"/>
@@ -2160,7 +2160,7 @@
             <w:noProof/>
             <w:webHidden/>
           </w:rPr>
-          <w:instrText xml:space="preserve"> PAGEREF _Toc241501789 \h </w:instrText>
+          <w:instrText xml:space="preserve"> PAGEREF _Toc241504595 \h </w:instrText>
         </w:r>
         <w:r>
           <w:rPr>
@@ -2180,7 +2180,7 @@
             <w:noProof/>
             <w:webHidden/>
           </w:rPr>
-          <w:t>10</w:t>
+          <w:t>11</w:t>
         </w:r>
         <w:r>
           <w:rPr>
@@ -2205,7 +2205,7 @@
           <w14:ligatures w14:val="standardContextual"/>
         </w:rPr>
       </w:pPr>
-      <w:hyperlink w:anchor="_Toc241501790" w:history="1">
+      <w:hyperlink w:anchor="_Toc241504596" w:history="1">
         <w:r>
           <w:rPr>
             <w:rStyle w:val="Hyperlink"/>
@@ -2232,7 +2232,7 @@
             <w:noProof/>
             <w:webHidden/>
           </w:rPr>
-          <w:instrText xml:space="preserve"> PAGEREF _Toc241501790 \h </w:instrText>
+          <w:instrText xml:space="preserve"> PAGEREF _Toc241504596 \h </w:instrText>
         </w:r>
         <w:r>
           <w:rPr>
@@ -2252,7 +2252,7 @@
             <w:noProof/>
             <w:webHidden/>
           </w:rPr>
-          <w:t>11</w:t>
+          <w:t>12</w:t>
         </w:r>
         <w:r>
           <w:rPr>
@@ -2280,7 +2280,7 @@
           <w14:ligatures w14:val="standardContextual"/>
         </w:rPr>
       </w:pPr>
-      <w:hyperlink w:anchor="_Toc241501791" w:history="1">
+      <w:hyperlink w:anchor="_Toc241504597" w:history="1">
         <w:r>
           <w:rPr>
             <w:rStyle w:val="Hyperlink"/>
@@ -2315,7 +2315,7 @@
             <w:noProof/>
             <w:webHidden/>
           </w:rPr>
-          <w:instrText xml:space="preserve"> PAGEREF _Toc241501791 \h </w:instrText>
+          <w:instrText xml:space="preserve"> PAGEREF _Toc241504597 \h </w:instrText>
         </w:r>
         <w:r>
           <w:rPr>
@@ -2335,7 +2335,7 @@
             <w:noProof/>
             <w:webHidden/>
           </w:rPr>
-          <w:t>11</w:t>
+          <w:t>12</w:t>
         </w:r>
         <w:r>
           <w:rPr>
@@ -2363,7 +2363,7 @@
           <w14:ligatures w14:val="standardContextual"/>
         </w:rPr>
       </w:pPr>
-      <w:hyperlink w:anchor="_Toc241501792" w:history="1">
+      <w:hyperlink w:anchor="_Toc241504598" w:history="1">
         <w:r>
           <w:rPr>
             <w:rStyle w:val="Hyperlink"/>
@@ -2398,7 +2398,7 @@
             <w:noProof/>
             <w:webHidden/>
           </w:rPr>
-          <w:instrText xml:space="preserve"> PAGEREF _Toc241501792 \h </w:instrText>
+          <w:instrText xml:space="preserve"> PAGEREF _Toc241504598 \h </w:instrText>
         </w:r>
         <w:r>
           <w:rPr>
@@ -2418,7 +2418,7 @@
             <w:noProof/>
             <w:webHidden/>
           </w:rPr>
-          <w:t>11</w:t>
+          <w:t>12</w:t>
         </w:r>
         <w:r>
           <w:rPr>
@@ -2446,7 +2446,7 @@
           <w14:ligatures w14:val="standardContextual"/>
         </w:rPr>
       </w:pPr>
-      <w:hyperlink w:anchor="_Toc241501793" w:history="1">
+      <w:hyperlink w:anchor="_Toc241504599" w:history="1">
         <w:r>
           <w:rPr>
             <w:rStyle w:val="Hyperlink"/>
@@ -2473,7 +2473,7 @@
             <w:noProof/>
             <w:webHidden/>
           </w:rPr>
-          <w:instrText xml:space="preserve"> PAGEREF _Toc241501793 \h </w:instrText>
+          <w:instrText xml:space="preserve"> PAGEREF _Toc241504599 \h </w:instrText>
         </w:r>
         <w:r>
           <w:rPr>
@@ -2493,7 +2493,7 @@
             <w:noProof/>
             <w:webHidden/>
           </w:rPr>
-          <w:t>12</w:t>
+          <w:t>13</w:t>
         </w:r>
         <w:r>
           <w:rPr>
@@ -2521,7 +2521,7 @@
           <w14:ligatures w14:val="standardContextual"/>
         </w:rPr>
       </w:pPr>
-      <w:hyperlink w:anchor="_Toc241501794" w:history="1">
+      <w:hyperlink w:anchor="_Toc241504600" w:history="1">
         <w:r>
           <w:rPr>
             <w:rStyle w:val="Hyperlink"/>
@@ -2551,7 +2551,7 @@
             <w:noProof/>
             <w:webHidden/>
           </w:rPr>
-          <w:instrText xml:space="preserve"> PAGEREF _Toc241501794 \h </w:instrText>
+          <w:instrText xml:space="preserve"> PAGEREF _Toc241504600 \h </w:instrText>
         </w:r>
         <w:r>
           <w:rPr>
@@ -2571,7 +2571,7 @@
             <w:noProof/>
             <w:webHidden/>
           </w:rPr>
-          <w:t>12</w:t>
+          <w:t>13</w:t>
         </w:r>
         <w:r>
           <w:rPr>
@@ -2599,7 +2599,7 @@
           <w14:ligatures w14:val="standardContextual"/>
         </w:rPr>
       </w:pPr>
-      <w:hyperlink w:anchor="_Toc241501795" w:history="1">
+      <w:hyperlink w:anchor="_Toc241504601" w:history="1">
         <w:r>
           <w:rPr>
             <w:rStyle w:val="Hyperlink"/>
@@ -2626,7 +2626,7 @@
             <w:noProof/>
             <w:webHidden/>
           </w:rPr>
-          <w:instrText xml:space="preserve"> PAGEREF _Toc241501795 \h </w:instrText>
+          <w:instrText xml:space="preserve"> PAGEREF _Toc241504601 \h </w:instrText>
         </w:r>
         <w:r>
           <w:rPr>
@@ -2646,7 +2646,7 @@
             <w:noProof/>
             <w:webHidden/>
           </w:rPr>
-          <w:t>12</w:t>
+          <w:t>13</w:t>
         </w:r>
         <w:r>
           <w:rPr>
@@ -2674,7 +2674,7 @@
           <w14:ligatures w14:val="standardContextual"/>
         </w:rPr>
       </w:pPr>
-      <w:hyperlink w:anchor="_Toc241501796" w:history="1">
+      <w:hyperlink w:anchor="_Toc241504602" w:history="1">
         <w:r>
           <w:rPr>
             <w:rStyle w:val="Hyperlink"/>
@@ -2704,7 +2704,7 @@
             <w:noProof/>
             <w:webHidden/>
           </w:rPr>
-          <w:instrText xml:space="preserve"> PAGEREF _Toc241501796 \h </w:instrText>
+          <w:instrText xml:space="preserve"> PAGEREF _Toc241504602 \h </w:instrText>
         </w:r>
         <w:r>
           <w:rPr>
@@ -2724,7 +2724,7 @@
             <w:noProof/>
             <w:webHidden/>
           </w:rPr>
-          <w:t>13</w:t>
+          <w:t>14</w:t>
         </w:r>
         <w:r>
           <w:rPr>
@@ -2749,7 +2749,7 @@
           <w14:ligatures w14:val="standardContextual"/>
         </w:rPr>
       </w:pPr>
-      <w:hyperlink w:anchor="_Toc241501797" w:history="1">
+      <w:hyperlink w:anchor="_Toc241504603" w:history="1">
         <w:r>
           <w:rPr>
             <w:rStyle w:val="Hyperlink"/>
@@ -2778,7 +2778,7 @@
             <w:noProof/>
             <w:webHidden/>
           </w:rPr>
-          <w:instrText xml:space="preserve"> PAGEREF _Toc241501797 \h </w:instrText>
+          <w:instrText xml:space="preserve"> PAGEREF _Toc241504603 \h </w:instrText>
         </w:r>
         <w:r>
           <w:rPr>
@@ -2798,7 +2798,7 @@
             <w:noProof/>
             <w:webHidden/>
           </w:rPr>
-          <w:t>14</w:t>
+          <w:t>15</w:t>
         </w:r>
         <w:r>
           <w:rPr>
@@ -2823,7 +2823,7 @@
           <w14:ligatures w14:val="standardContextual"/>
         </w:rPr>
       </w:pPr>
-      <w:hyperlink w:anchor="_Toc241501798" w:history="1">
+      <w:hyperlink w:anchor="_Toc241504604" w:history="1">
         <w:r>
           <w:rPr>
             <w:rStyle w:val="Hyperlink"/>
@@ -2852,7 +2852,7 @@
             <w:noProof/>
             <w:webHidden/>
           </w:rPr>
-          <w:instrText xml:space="preserve"> PAGEREF _Toc241501798 \h </w:instrText>
+          <w:instrText xml:space="preserve"> PAGEREF _Toc241504604 \h </w:instrText>
         </w:r>
         <w:r>
           <w:rPr>
@@ -2872,7 +2872,7 @@
             <w:noProof/>
             <w:webHidden/>
           </w:rPr>
-          <w:t>15</w:t>
+          <w:t>16</w:t>
         </w:r>
         <w:r>
           <w:rPr>
@@ -2897,7 +2897,7 @@
           <w14:ligatures w14:val="standardContextual"/>
         </w:rPr>
       </w:pPr>
-      <w:hyperlink w:anchor="_Toc241501799" w:history="1">
+      <w:hyperlink w:anchor="_Toc241504605" w:history="1">
         <w:r>
           <w:rPr>
             <w:rStyle w:val="Hyperlink"/>
@@ -2927,7 +2927,7 @@
             <w:noProof/>
             <w:webHidden/>
           </w:rPr>
-          <w:instrText xml:space="preserve"> PAGEREF _Toc241501799 \h </w:instrText>
+          <w:instrText xml:space="preserve"> PAGEREF _Toc241504605 \h </w:instrText>
         </w:r>
         <w:r>
           <w:rPr>
@@ -2947,7 +2947,7 @@
             <w:noProof/>
             <w:webHidden/>
           </w:rPr>
-          <w:t>16</w:t>
+          <w:t>17</w:t>
         </w:r>
         <w:r>
           <w:rPr>
@@ -2975,7 +2975,7 @@
           <w14:ligatures w14:val="standardContextual"/>
         </w:rPr>
       </w:pPr>
-      <w:hyperlink w:anchor="_Toc241501800" w:history="1">
+      <w:hyperlink w:anchor="_Toc241504606" w:history="1">
         <w:r>
           <w:rPr>
             <w:rStyle w:val="Hyperlink"/>
@@ -3002,7 +3002,7 @@
             <w:noProof/>
             <w:webHidden/>
           </w:rPr>
-          <w:instrText xml:space="preserve"> PAGEREF _Toc241501800 \h </w:instrText>
+          <w:instrText xml:space="preserve"> PAGEREF _Toc241504606 \h </w:instrText>
         </w:r>
         <w:r>
           <w:rPr>
@@ -3022,7 +3022,7 @@
             <w:noProof/>
             <w:webHidden/>
           </w:rPr>
-          <w:t>16</w:t>
+          <w:t>17</w:t>
         </w:r>
         <w:r>
           <w:rPr>
@@ -3050,7 +3050,7 @@
           <w14:ligatures w14:val="standardContextual"/>
         </w:rPr>
       </w:pPr>
-      <w:hyperlink w:anchor="_Toc241501801" w:history="1">
+      <w:hyperlink w:anchor="_Toc241504607" w:history="1">
         <w:r>
           <w:rPr>
             <w:rStyle w:val="Hyperlink"/>
@@ -3077,7 +3077,7 @@
             <w:noProof/>
             <w:webHidden/>
           </w:rPr>
-          <w:instrText xml:space="preserve"> PAGEREF _Toc241501801 \h </w:instrText>
+          <w:instrText xml:space="preserve"> PAGEREF _Toc241504607 \h </w:instrText>
         </w:r>
         <w:r>
           <w:rPr>
@@ -3097,7 +3097,7 @@
             <w:noProof/>
             <w:webHidden/>
           </w:rPr>
-          <w:t>16</w:t>
+          <w:t>17</w:t>
         </w:r>
         <w:r>
           <w:rPr>
@@ -3125,7 +3125,7 @@
           <w14:ligatures w14:val="standardContextual"/>
         </w:rPr>
       </w:pPr>
-      <w:hyperlink w:anchor="_Toc241501802" w:history="1">
+      <w:hyperlink w:anchor="_Toc241504608" w:history="1">
         <w:r>
           <w:rPr>
             <w:rStyle w:val="Hyperlink"/>
@@ -3152,7 +3152,7 @@
             <w:noProof/>
             <w:webHidden/>
           </w:rPr>
-          <w:instrText xml:space="preserve"> PAGEREF _Toc241501802 \h </w:instrText>
+          <w:instrText xml:space="preserve"> PAGEREF _Toc241504608 \h </w:instrText>
         </w:r>
         <w:r>
           <w:rPr>
@@ -3172,7 +3172,7 @@
             <w:noProof/>
             <w:webHidden/>
           </w:rPr>
-          <w:t>16</w:t>
+          <w:t>17</w:t>
         </w:r>
         <w:r>
           <w:rPr>
@@ -3228,7 +3228,7 @@
       <w:r>
         <w:fldChar w:fldCharType="separate"/>
       </w:r>
-      <w:hyperlink w:anchor="_Toc241501803" w:history="1">
+      <w:hyperlink w:anchor="_Toc241504609" w:history="1">
         <w:r>
           <w:rPr>
             <w:rStyle w:val="Hyperlink"/>
@@ -3255,7 +3255,7 @@
             <w:noProof/>
             <w:webHidden/>
           </w:rPr>
-          <w:instrText xml:space="preserve"> PAGEREF _Toc241501803 \h </w:instrText>
+          <w:instrText xml:space="preserve"> PAGEREF _Toc241504609 \h </w:instrText>
         </w:r>
         <w:r>
           <w:rPr>
@@ -3275,7 +3275,7 @@
             <w:noProof/>
             <w:webHidden/>
           </w:rPr>
-          <w:t>4</w:t>
+          <w:t>5</w:t>
         </w:r>
         <w:r>
           <w:rPr>
@@ -3300,7 +3300,7 @@
           <w14:ligatures w14:val="standardContextual"/>
         </w:rPr>
       </w:pPr>
-      <w:hyperlink w:anchor="_Toc241501804" w:history="1">
+      <w:hyperlink w:anchor="_Toc241504610" w:history="1">
         <w:r>
           <w:rPr>
             <w:rStyle w:val="Hyperlink"/>
@@ -3327,7 +3327,7 @@
             <w:noProof/>
             <w:webHidden/>
           </w:rPr>
-          <w:instrText xml:space="preserve"> PAGEREF _Toc241501804 \h </w:instrText>
+          <w:instrText xml:space="preserve"> PAGEREF _Toc241504610 \h </w:instrText>
         </w:r>
         <w:r>
           <w:rPr>
@@ -3347,7 +3347,7 @@
             <w:noProof/>
             <w:webHidden/>
           </w:rPr>
-          <w:t>6</w:t>
+          <w:t>7</w:t>
         </w:r>
         <w:r>
           <w:rPr>
@@ -3372,7 +3372,7 @@
           <w14:ligatures w14:val="standardContextual"/>
         </w:rPr>
       </w:pPr>
-      <w:hyperlink w:anchor="_Toc241501805" w:history="1">
+      <w:hyperlink w:anchor="_Toc241504611" w:history="1">
         <w:r>
           <w:rPr>
             <w:rStyle w:val="Hyperlink"/>
@@ -3399,7 +3399,7 @@
             <w:noProof/>
             <w:webHidden/>
           </w:rPr>
-          <w:instrText xml:space="preserve"> PAGEREF _Toc241501805 \h </w:instrText>
+          <w:instrText xml:space="preserve"> PAGEREF _Toc241504611 \h </w:instrText>
         </w:r>
         <w:r>
           <w:rPr>
@@ -3419,7 +3419,7 @@
             <w:noProof/>
             <w:webHidden/>
           </w:rPr>
-          <w:t>8</w:t>
+          <w:t>9</w:t>
         </w:r>
         <w:r>
           <w:rPr>
@@ -3444,7 +3444,7 @@
           <w14:ligatures w14:val="standardContextual"/>
         </w:rPr>
       </w:pPr>
-      <w:hyperlink w:anchor="_Toc241501806" w:history="1">
+      <w:hyperlink w:anchor="_Toc241504612" w:history="1">
         <w:r>
           <w:rPr>
             <w:rStyle w:val="Hyperlink"/>
@@ -3471,7 +3471,7 @@
             <w:noProof/>
             <w:webHidden/>
           </w:rPr>
-          <w:instrText xml:space="preserve"> PAGEREF _Toc241501806 \h </w:instrText>
+          <w:instrText xml:space="preserve"> PAGEREF _Toc241504612 \h </w:instrText>
         </w:r>
         <w:r>
           <w:rPr>
@@ -3491,7 +3491,7 @@
             <w:noProof/>
             <w:webHidden/>
           </w:rPr>
-          <w:t>8</w:t>
+          <w:t>9</w:t>
         </w:r>
         <w:r>
           <w:rPr>
@@ -3545,7 +3545,7 @@
       <w:r>
         <w:fldChar w:fldCharType="separate"/>
       </w:r>
-      <w:hyperlink w:anchor="_Toc241501807" w:history="1">
+      <w:hyperlink w:anchor="_Toc241504613" w:history="1">
         <w:r>
           <w:rPr>
             <w:rStyle w:val="Hyperlink"/>
@@ -3572,7 +3572,7 @@
             <w:noProof/>
             <w:webHidden/>
           </w:rPr>
-          <w:instrText xml:space="preserve"> PAGEREF _Toc241501807 \h </w:instrText>
+          <w:instrText xml:space="preserve"> PAGEREF _Toc241504613 \h </w:instrText>
         </w:r>
         <w:r>
           <w:rPr>
@@ -3592,7 +3592,7 @@
             <w:noProof/>
             <w:webHidden/>
           </w:rPr>
-          <w:t>4</w:t>
+          <w:t>5</w:t>
         </w:r>
         <w:r>
           <w:rPr>
@@ -3617,7 +3617,7 @@
           <w14:ligatures w14:val="standardContextual"/>
         </w:rPr>
       </w:pPr>
-      <w:hyperlink w:anchor="_Toc241501808" w:history="1">
+      <w:hyperlink w:anchor="_Toc241504614" w:history="1">
         <w:r>
           <w:rPr>
             <w:rStyle w:val="Hyperlink"/>
@@ -3644,7 +3644,7 @@
             <w:noProof/>
             <w:webHidden/>
           </w:rPr>
-          <w:instrText xml:space="preserve"> PAGEREF _Toc241501808 \h </w:instrText>
+          <w:instrText xml:space="preserve"> PAGEREF _Toc241504614 \h </w:instrText>
         </w:r>
         <w:r>
           <w:rPr>
@@ -3664,7 +3664,7 @@
             <w:noProof/>
             <w:webHidden/>
           </w:rPr>
-          <w:t>5</w:t>
+          <w:t>6</w:t>
         </w:r>
         <w:r>
           <w:rPr>
@@ -3689,7 +3689,7 @@
           <w14:ligatures w14:val="standardContextual"/>
         </w:rPr>
       </w:pPr>
-      <w:hyperlink w:anchor="_Toc241501809" w:history="1">
+      <w:hyperlink w:anchor="_Toc241504615" w:history="1">
         <w:r>
           <w:rPr>
             <w:rStyle w:val="Hyperlink"/>
@@ -3716,7 +3716,7 @@
             <w:noProof/>
             <w:webHidden/>
           </w:rPr>
-          <w:instrText xml:space="preserve"> PAGEREF _Toc241501809 \h </w:instrText>
+          <w:instrText xml:space="preserve"> PAGEREF _Toc241504615 \h </w:instrText>
         </w:r>
         <w:r>
           <w:rPr>
@@ -3736,7 +3736,7 @@
             <w:noProof/>
             <w:webHidden/>
           </w:rPr>
-          <w:t>7</w:t>
+          <w:t>8</w:t>
         </w:r>
         <w:r>
           <w:rPr>
@@ -3761,7 +3761,7 @@
           <w14:ligatures w14:val="standardContextual"/>
         </w:rPr>
       </w:pPr>
-      <w:hyperlink w:anchor="_Toc241501810" w:history="1">
+      <w:hyperlink w:anchor="_Toc241504616" w:history="1">
         <w:r>
           <w:rPr>
             <w:rStyle w:val="Hyperlink"/>
@@ -3788,7 +3788,7 @@
             <w:noProof/>
             <w:webHidden/>
           </w:rPr>
-          <w:instrText xml:space="preserve"> PAGEREF _Toc241501810 \h </w:instrText>
+          <w:instrText xml:space="preserve"> PAGEREF _Toc241504616 \h </w:instrText>
         </w:r>
         <w:r>
           <w:rPr>
@@ -3808,7 +3808,7 @@
             <w:noProof/>
             <w:webHidden/>
           </w:rPr>
-          <w:t>9</w:t>
+          <w:t>10</w:t>
         </w:r>
         <w:r>
           <w:rPr>
@@ -3833,7 +3833,7 @@
           <w14:ligatures w14:val="standardContextual"/>
         </w:rPr>
       </w:pPr>
-      <w:hyperlink w:anchor="_Toc241501811" w:history="1">
+      <w:hyperlink w:anchor="_Toc241504617" w:history="1">
         <w:r>
           <w:rPr>
             <w:rStyle w:val="Hyperlink"/>
@@ -3860,7 +3860,7 @@
             <w:noProof/>
             <w:webHidden/>
           </w:rPr>
-          <w:instrText xml:space="preserve"> PAGEREF _Toc241501811 \h </w:instrText>
+          <w:instrText xml:space="preserve"> PAGEREF _Toc241504617 \h </w:instrText>
         </w:r>
         <w:r>
           <w:rPr>
@@ -3880,7 +3880,7 @@
             <w:noProof/>
             <w:webHidden/>
           </w:rPr>
-          <w:t>10</w:t>
+          <w:t>11</w:t>
         </w:r>
         <w:r>
           <w:rPr>
@@ -3905,7 +3905,7 @@
           <w14:ligatures w14:val="standardContextual"/>
         </w:rPr>
       </w:pPr>
-      <w:hyperlink w:anchor="_Toc241501812" w:history="1">
+      <w:hyperlink w:anchor="_Toc241504618" w:history="1">
         <w:r>
           <w:rPr>
             <w:rStyle w:val="Hyperlink"/>
@@ -3932,7 +3932,7 @@
             <w:noProof/>
             <w:webHidden/>
           </w:rPr>
-          <w:instrText xml:space="preserve"> PAGEREF _Toc241501812 \h </w:instrText>
+          <w:instrText xml:space="preserve"> PAGEREF _Toc241504618 \h </w:instrText>
         </w:r>
         <w:r>
           <w:rPr>
@@ -3952,7 +3952,7 @@
             <w:noProof/>
             <w:webHidden/>
           </w:rPr>
-          <w:t>11</w:t>
+          <w:t>12</w:t>
         </w:r>
         <w:r>
           <w:rPr>
@@ -3977,7 +3977,7 @@
           <w14:ligatures w14:val="standardContextual"/>
         </w:rPr>
       </w:pPr>
-      <w:hyperlink w:anchor="_Toc241501813" w:history="1">
+      <w:hyperlink w:anchor="_Toc241504619" w:history="1">
         <w:r>
           <w:rPr>
             <w:rStyle w:val="Hyperlink"/>
@@ -4004,7 +4004,7 @@
             <w:noProof/>
             <w:webHidden/>
           </w:rPr>
-          <w:instrText xml:space="preserve"> PAGEREF _Toc241501813 \h </w:instrText>
+          <w:instrText xml:space="preserve"> PAGEREF _Toc241504619 \h </w:instrText>
         </w:r>
         <w:r>
           <w:rPr>
@@ -4024,7 +4024,7 @@
             <w:noProof/>
             <w:webHidden/>
           </w:rPr>
-          <w:t>11</w:t>
+          <w:t>12</w:t>
         </w:r>
         <w:r>
           <w:rPr>
@@ -4049,7 +4049,7 @@
           <w14:ligatures w14:val="standardContextual"/>
         </w:rPr>
       </w:pPr>
-      <w:hyperlink w:anchor="_Toc241501814" w:history="1">
+      <w:hyperlink w:anchor="_Toc241504620" w:history="1">
         <w:r>
           <w:rPr>
             <w:rStyle w:val="Hyperlink"/>
@@ -4076,7 +4076,7 @@
             <w:noProof/>
             <w:webHidden/>
           </w:rPr>
-          <w:instrText xml:space="preserve"> PAGEREF _Toc241501814 \h </w:instrText>
+          <w:instrText xml:space="preserve"> PAGEREF _Toc241504620 \h </w:instrText>
         </w:r>
         <w:r>
           <w:rPr>
@@ -4096,7 +4096,7 @@
             <w:noProof/>
             <w:webHidden/>
           </w:rPr>
-          <w:t>12</w:t>
+          <w:t>13</w:t>
         </w:r>
         <w:r>
           <w:rPr>
@@ -4121,7 +4121,7 @@
           <w14:ligatures w14:val="standardContextual"/>
         </w:rPr>
       </w:pPr>
-      <w:hyperlink w:anchor="_Toc241501815" w:history="1">
+      <w:hyperlink w:anchor="_Toc241504621" w:history="1">
         <w:r>
           <w:rPr>
             <w:rStyle w:val="Hyperlink"/>
@@ -4148,7 +4148,7 @@
             <w:noProof/>
             <w:webHidden/>
           </w:rPr>
-          <w:instrText xml:space="preserve"> PAGEREF _Toc241501815 \h </w:instrText>
+          <w:instrText xml:space="preserve"> PAGEREF _Toc241504621 \h </w:instrText>
         </w:r>
         <w:r>
           <w:rPr>
@@ -4168,7 +4168,7 @@
             <w:noProof/>
             <w:webHidden/>
           </w:rPr>
-          <w:t>13</w:t>
+          <w:t>14</w:t>
         </w:r>
         <w:r>
           <w:rPr>
@@ -4193,7 +4193,7 @@
           <w14:ligatures w14:val="standardContextual"/>
         </w:rPr>
       </w:pPr>
-      <w:hyperlink w:anchor="_Toc241501816" w:history="1">
+      <w:hyperlink w:anchor="_Toc241504622" w:history="1">
         <w:r>
           <w:rPr>
             <w:rStyle w:val="Hyperlink"/>
@@ -4220,7 +4220,7 @@
             <w:noProof/>
             <w:webHidden/>
           </w:rPr>
-          <w:instrText xml:space="preserve"> PAGEREF _Toc241501816 \h </w:instrText>
+          <w:instrText xml:space="preserve"> PAGEREF _Toc241504622 \h </w:instrText>
         </w:r>
         <w:r>
           <w:rPr>
@@ -4240,7 +4240,7 @@
             <w:noProof/>
             <w:webHidden/>
           </w:rPr>
-          <w:t>16</w:t>
+          <w:t>17</w:t>
         </w:r>
         <w:r>
           <w:rPr>
@@ -4285,7 +4285,7 @@
           <w:lang w:val="en-ID"/>
         </w:rPr>
       </w:pPr>
-      <w:bookmarkStart w:id="1" w:name="_Toc241501770"/>
+      <w:bookmarkStart w:id="1" w:name="_Toc241504576"/>
       <w:r>
         <w:rPr>
           <w:rFonts w:ascii="Times New Roman" w:hAnsi="Times New Roman"/>
@@ -4318,7 +4318,7 @@
         </w:rPr>
       </w:pPr>
       <w:bookmarkStart w:id="2" w:name="_Toc241072596"/>
-      <w:bookmarkStart w:id="3" w:name="_Toc241501771"/>
+      <w:bookmarkStart w:id="3" w:name="_Toc241504577"/>
       <w:r>
         <w:rPr>
           <w:szCs w:val="24"/>
@@ -4755,6 +4755,7 @@
     <w:p>
       <w:pPr>
         <w:pStyle w:val="Heading2"/>
+        <w:pageBreakBefore/>
         <w:spacing w:before="0" w:beforeAutospacing="0" w:afterAutospacing="0"/>
         <w:jc w:val="both"/>
         <w:rPr>
@@ -4763,12 +4764,13 @@
         </w:rPr>
       </w:pPr>
       <w:bookmarkStart w:id="4" w:name="_Toc241072597"/>
-      <w:bookmarkStart w:id="5" w:name="_Toc241501772"/>
+      <w:bookmarkStart w:id="5" w:name="_Toc241504578"/>
       <w:r>
         <w:rPr>
           <w:szCs w:val="24"/>
           <w:lang w:val="en-ID"/>
         </w:rPr>
+        <w:lastRenderedPageBreak/>
         <w:t>1.</w:t>
       </w:r>
       <w:r>
@@ -4823,20 +4825,7 @@
         </w:rPr>
       </w:pPr>
       <w:r>
-        <w:rPr>
-          <w:rFonts w:cs="Times New Roman"/>
-          <w:szCs w:val="24"/>
-          <w:lang w:val="en-ID"/>
-        </w:rPr>
-        <w:t>Perancangan solusi Big Data Olist didorong oleh dinamika pasar internal dan eksternal yang terbagi ke dalam tiga poros utama</w:t>
-      </w:r>
-      <w:r>
-        <w:rPr>
-          <w:rFonts w:cs="Times New Roman"/>
-          <w:szCs w:val="24"/>
-          <w:lang w:val="en-ID"/>
-        </w:rPr>
-        <w:t>:</w:t>
+        <w:t>Rancangan menghubungkan konteks pasar, masalah operasional yang terukur, dan kebutuhan informasi stakeholder. Sumber eksternal menjelaskan relevansi bisnis; dataset Olist 2016–2018 menyediakan bukti historis untuk studi ini.</w:t>
       </w:r>
     </w:p>
     <w:p>
@@ -4857,28 +4846,7 @@
         </w:rPr>
       </w:pPr>
       <w:r>
-        <w:rPr>
-          <w:rFonts w:cs="Times New Roman"/>
-          <w:szCs w:val="24"/>
-          <w:lang w:val="en-ID"/>
-        </w:rPr>
-        <w:t>Market Drivers (</w:t>
-      </w:r>
-      <w:r>
-        <w:rPr>
-          <w:rFonts w:cs="Times New Roman"/>
-          <w:szCs w:val="24"/>
-          <w:lang w:val="en-ID"/>
-        </w:rPr>
-        <w:t>Dinamika Pasar External</w:t>
-      </w:r>
-      <w:r>
-        <w:rPr>
-          <w:rFonts w:cs="Times New Roman"/>
-          <w:szCs w:val="24"/>
-          <w:lang w:val="en-ID"/>
-        </w:rPr>
-        <w:t>)</w:t>
+        <w:t>Market Drivers (Kepercayaan dan Layanan Pengiriman)</w:t>
       </w:r>
     </w:p>
     <w:p>
@@ -4895,7 +4863,7 @@
         </w:rPr>
       </w:pPr>
       <w:r>
-        <w:t>Kebutuhan ketepatan dan transparansi estimasi pengiriman menjadi market driver yang diusulkan dalam studi ini. Dataset historis belum membuktikan pertumbuhan pasar tahunan lebih dari 20%, customer churn, maupun perubahan tuntutan pelanggan saat ini; klaim kuantitatif tersebut tidak dipakai sebagai hasil penelitian.</w:t>
+        <w:t>DHL Group (2026) melaporkan survei 29.000 pembeli online dan 5.800 bisnis di 29 negara; 20% pembeli menyatakan pengiriman lebih cepat dapat mendorong penyelesaian pembelian. OECD (2019) menjelaskan peran ulasan dan rating dalam membangun kepercayaan serta keterlibatan pengguna platform. Keduanya mendukung relevansi layanan pengiriman dan informasi pengalaman pelanggan. Survei global 2026 merupakan konteks pasar yang lebih baru, bukan ukuran perilaku pelanggan Olist Brazil pada 2016–2018; preferensi pengiriman cepat juga berbeda dari keterlambatan terhadap estimasi. Studi ini memakai delay rate 8,11% dan perbedaan review 4,2943 versus 2,5665 untuk memprioritaskan evaluasi, tanpa mengklaim pengaruh kausal atau pertumbuhan pasar tertentu.</w:t>
       </w:r>
     </w:p>
     <w:p>
@@ -4916,12 +4884,7 @@
         </w:rPr>
       </w:pPr>
       <w:r>
-        <w:rPr>
-          <w:rFonts w:cs="Times New Roman"/>
-          <w:szCs w:val="24"/>
-          <w:lang w:val="en-ID"/>
-        </w:rPr>
-        <w:t>Business Drivers (Efisiensi Biaya Logistik)</w:t>
+        <w:t>Business Drivers (Prioritas Perbaikan Operasional)</w:t>
       </w:r>
     </w:p>
     <w:p>
@@ -4938,7 +4901,7 @@
         </w:rPr>
       </w:pPr>
       <w:r>
-        <w:t>Keberhasilan bisnis yang ditargetkan adalah penurunan delay rate dan perbaikan review pada populasi yang sebanding setelah tindakan operasional, dengan definisi label yang konsisten. Target penurunan numerik belum ditetapkan karena belum ada intervensi, estimasi biaya, atau validasi kausal. VP of Logistics menggunakan analisis rute untuk menentukan investigasi; Head of Merchant Performance menggunakan sinyal risiko order setelah approval untuk peninjauan; manajemen eksekutif memantau indikator agregat. Dampak kompensasi dan manfaat finansial belum dihitung; freight_value adalah atribut yang tersedia, bukan biaya total operasional.</w:t>
+        <w:t>Tujuan operasional adalah menurunkan delay rate dan mengevaluasi kepuasan setelah tindakan pada populasi sebanding. VP of Logistics memprioritaskan investigasi SP → RJ (8.158 order; delay 15,49%); Head of Merchant Performance meninjau risiko order setelah approval; manajemen eksekutif memantau indikator agregat. Keberhasilan dinilai melalui delay rate dan review per order dengan definisi/populasi yang konsisten. Data belum memuat intervensi, biaya kompensasi, atau pengukuran kausal, sehingga target penurunan numerik dan penghematan uang belum ditetapkan. freight_value adalah nilai ongkir pada sumber, bukan biaya total operasional atau kerugian akibat delay.</w:t>
       </w:r>
     </w:p>
     <w:p>
@@ -4960,13 +4923,7 @@
         </w:rPr>
       </w:pPr>
       <w:r>
-        <w:rPr>
-          <w:rFonts w:cs="Times New Roman"/>
-          <w:szCs w:val="24"/>
-          <w:lang w:val="en-ID"/>
-        </w:rPr>
-        <w:lastRenderedPageBreak/>
-        <w:t>Scalable Analytics &amp; Intelligence Drivers</w:t>
+        <w:t>Analytics Drivers (Konsistensi Data dan Keputusan)</w:t>
       </w:r>
     </w:p>
     <w:p>
@@ -4983,12 +4940,13 @@
         </w:rPr>
       </w:pPr>
       <w:r>
-        <w:t>Tujuan analitik yang diusulkan adalah menyediakan data lintas tabel yang konsisten untuk pelaporan dan prediksi. Prototipe mengukur ukuran storage dan menghasilkan audit kualitas; klaim respons kueri dalam hitungan detik atau peningkatan sistem produksi memerlukan benchmark lanjutan.</w:t>
+        <w:t>Keputusan lintas stakeholder memerlukan ukuran yang dapat ditelusuri dari sumber ke hasil. Karena itu, rancangan memakai validasi sembilan tabel, agregasi sebelum join, dan fitur satu baris per order. Parquet menghemat storage 54,93%; ini hasil terukur, bukan bukti percepatan kueri. Model dan graf menghasilkan sinyal awal untuk peninjauan, dengan precision model yang masih rendah. Benchmark waktu proses, evaluasi biaya intervensi, dan uji temporal diperlukan sebelum memperluas layanan atau deployment cluster (Hasil eksekusi lokal, 2026).</w:t>
       </w:r>
     </w:p>
     <w:p>
       <w:pPr>
         <w:pStyle w:val="Heading2"/>
+        <w:pageBreakBefore/>
         <w:spacing w:before="0" w:beforeAutospacing="0" w:afterAutospacing="0"/>
         <w:jc w:val="both"/>
         <w:rPr>
@@ -4997,12 +4955,13 @@
         </w:rPr>
       </w:pPr>
       <w:bookmarkStart w:id="6" w:name="_Toc241072598"/>
-      <w:bookmarkStart w:id="7" w:name="_Toc241501773"/>
+      <w:bookmarkStart w:id="7" w:name="_Toc241504579"/>
       <w:r>
         <w:rPr>
           <w:szCs w:val="24"/>
           <w:lang w:val="en-ID"/>
         </w:rPr>
+        <w:lastRenderedPageBreak/>
         <w:t>1.</w:t>
       </w:r>
       <w:r>
@@ -5066,7 +5025,7 @@
       <w:r>
         <w:instrText>TC "</w:instrText>
       </w:r>
-      <w:bookmarkStart w:id="8" w:name="_Toc241501807"/>
+      <w:bookmarkStart w:id="8" w:name="_Toc241504613"/>
       <w:r>
         <w:instrText>Tabel 1.1 Matriks Analisis Pemangku Kepentingan (Stakeholder Analysis)</w:instrText>
       </w:r>
@@ -5880,7 +5839,7 @@
       <w:r>
         <w:instrText>TC "</w:instrText>
       </w:r>
-      <w:bookmarkStart w:id="9" w:name="_Toc241501803"/>
+      <w:bookmarkStart w:id="9" w:name="_Toc241504609"/>
       <w:r>
         <w:instrText>Gambar 1.1 Arsitektur prototipe dan komponen yang masih diusulkan</w:instrText>
       </w:r>
@@ -5908,7 +5867,7 @@
           <w:szCs w:val="24"/>
         </w:rPr>
       </w:pPr>
-      <w:bookmarkStart w:id="10" w:name="_Toc241501774"/>
+      <w:bookmarkStart w:id="10" w:name="_Toc241504580"/>
       <w:r>
         <w:rPr>
           <w:rFonts w:ascii="Times New Roman" w:hAnsi="Times New Roman"/>
@@ -5940,7 +5899,7 @@
         </w:rPr>
       </w:pPr>
       <w:bookmarkStart w:id="11" w:name="_Toc241072600"/>
-      <w:bookmarkStart w:id="12" w:name="_Toc241501775"/>
+      <w:bookmarkStart w:id="12" w:name="_Toc241504581"/>
       <w:r>
         <w:rPr>
           <w:szCs w:val="24"/>
@@ -6076,7 +6035,7 @@
         </w:rPr>
       </w:pPr>
       <w:bookmarkStart w:id="13" w:name="_Toc241072601"/>
-      <w:bookmarkStart w:id="14" w:name="_Toc241501776"/>
+      <w:bookmarkStart w:id="14" w:name="_Toc241504582"/>
       <w:r>
         <w:rPr>
           <w:szCs w:val="24"/>
@@ -6121,7 +6080,7 @@
         </w:rPr>
       </w:pPr>
       <w:bookmarkStart w:id="15" w:name="_Toc241072602"/>
-      <w:bookmarkStart w:id="16" w:name="_Toc241501777"/>
+      <w:bookmarkStart w:id="16" w:name="_Toc241504583"/>
       <w:r>
         <w:rPr>
           <w:rFonts w:ascii="Times New Roman" w:hAnsi="Times New Roman" w:cs="Times New Roman"/>
@@ -6229,7 +6188,7 @@
       <w:r>
         <w:instrText>TC "</w:instrText>
       </w:r>
-      <w:bookmarkStart w:id="17" w:name="_Toc241501808"/>
+      <w:bookmarkStart w:id="17" w:name="_Toc241504614"/>
       <w:r>
         <w:instrText>Tabel 2.1 Perbandingan Ukuran Storage File CSV vs Parquet Columnar Storage</w:instrText>
       </w:r>
@@ -7790,7 +7749,7 @@
       <w:r>
         <w:instrText>TC "</w:instrText>
       </w:r>
-      <w:bookmarkStart w:id="18" w:name="_Toc241501804"/>
+      <w:bookmarkStart w:id="18" w:name="_Toc241504610"/>
       <w:r>
         <w:instrText>Gambar 2.1 Ukuran CSV dan Parquet pada sembilan tabel</w:instrText>
       </w:r>
@@ -7815,7 +7774,7 @@
         </w:rPr>
       </w:pPr>
       <w:bookmarkStart w:id="19" w:name="_Toc241072603"/>
-      <w:bookmarkStart w:id="20" w:name="_Toc241501778"/>
+      <w:bookmarkStart w:id="20" w:name="_Toc241504584"/>
       <w:r>
         <w:rPr>
           <w:rFonts w:ascii="Times New Roman" w:hAnsi="Times New Roman" w:cs="Times New Roman"/>
@@ -8110,7 +8069,7 @@
         </w:rPr>
       </w:pPr>
       <w:bookmarkStart w:id="21" w:name="_Toc241072604"/>
-      <w:bookmarkStart w:id="22" w:name="_Toc241501779"/>
+      <w:bookmarkStart w:id="22" w:name="_Toc241504585"/>
       <w:r>
         <w:rPr>
           <w:rFonts w:ascii="Times New Roman" w:hAnsi="Times New Roman" w:cs="Times New Roman"/>
@@ -8191,7 +8150,7 @@
           <w:lang w:val="en-ID"/>
         </w:rPr>
       </w:pPr>
-      <w:bookmarkStart w:id="23" w:name="_Toc241501780"/>
+      <w:bookmarkStart w:id="23" w:name="_Toc241504586"/>
       <w:r>
         <w:rPr>
           <w:rFonts w:ascii="Times New Roman" w:hAnsi="Times New Roman"/>
@@ -8227,7 +8186,7 @@
         </w:rPr>
       </w:pPr>
       <w:bookmarkStart w:id="24" w:name="_Toc241072606"/>
-      <w:bookmarkStart w:id="25" w:name="_Toc241501781"/>
+      <w:bookmarkStart w:id="25" w:name="_Toc241504587"/>
       <w:r>
         <w:rPr>
           <w:szCs w:val="24"/>
@@ -8295,7 +8254,7 @@
           <w:lang w:val="en-ID"/>
         </w:rPr>
       </w:pPr>
-      <w:bookmarkStart w:id="26" w:name="_Toc241501782"/>
+      <w:bookmarkStart w:id="26" w:name="_Toc241504588"/>
       <w:r>
         <w:rPr>
           <w:rFonts w:ascii="Times New Roman" w:hAnsi="Times New Roman"/>
@@ -8354,7 +8313,7 @@
       <w:r>
         <w:instrText>TC "</w:instrText>
       </w:r>
-      <w:bookmarkStart w:id="27" w:name="_Toc241501809"/>
+      <w:bookmarkStart w:id="27" w:name="_Toc241504615"/>
       <w:r>
         <w:instrText>Tabel 2.2 Evaluasi awal model pada data test yang sama</w:instrText>
       </w:r>
@@ -9046,7 +9005,7 @@
       <w:r>
         <w:instrText>TC "</w:instrText>
       </w:r>
-      <w:bookmarkStart w:id="28" w:name="_Toc241501805"/>
+      <w:bookmarkStart w:id="28" w:name="_Toc241504611"/>
       <w:r>
         <w:instrText>Gambar 2.2 Lima feature importance terbesar pada model terpilih</w:instrText>
       </w:r>
@@ -9080,7 +9039,7 @@
         </w:rPr>
       </w:pPr>
       <w:bookmarkStart w:id="29" w:name="_Toc241072608"/>
-      <w:bookmarkStart w:id="30" w:name="_Toc241501783"/>
+      <w:bookmarkStart w:id="30" w:name="_Toc241504589"/>
       <w:r>
         <w:rPr>
           <w:rFonts w:ascii="Times New Roman" w:hAnsi="Times New Roman" w:cs="Times New Roman"/>
@@ -9166,12 +9125,7 @@
         </w:rPr>
       </w:pPr>
       <w:r>
-        <w:rPr>
-          <w:rFonts w:cs="Times New Roman"/>
-          <w:szCs w:val="24"/>
-          <w:lang w:val="en-ID"/>
-        </w:rPr>
-        <w:t>Top Seller Hub (Pusat Penjual Terbesar)</w:t>
+        <w:t>State Asal Penjual dengan Volume Terbesar</w:t>
       </w:r>
     </w:p>
     <w:p>
@@ -9209,12 +9163,7 @@
         </w:rPr>
       </w:pPr>
       <w:r>
-        <w:rPr>
-          <w:rFonts w:cs="Times New Roman"/>
-          <w:szCs w:val="24"/>
-          <w:lang w:val="en-ID"/>
-        </w:rPr>
-        <w:t>Top Market Sink (Pasar Konsumen Terbesar)</w:t>
+        <w:t>State Tujuan Pelanggan dengan Volume Terbesar</w:t>
       </w:r>
     </w:p>
     <w:p>
@@ -9252,12 +9201,7 @@
         </w:rPr>
       </w:pPr>
       <w:r>
-        <w:rPr>
-          <w:rFonts w:cs="Times New Roman"/>
-          <w:szCs w:val="24"/>
-          <w:lang w:val="en-ID"/>
-        </w:rPr>
-        <w:t>Top Critical Bottleneck Route</w:t>
+        <w:t>Prioritas Investigasi Rute</w:t>
       </w:r>
     </w:p>
     <w:p>
@@ -9349,7 +9293,7 @@
       <w:r>
         <w:instrText>TC "</w:instrText>
       </w:r>
-      <w:bookmarkStart w:id="31" w:name="_Toc241501806"/>
+      <w:bookmarkStart w:id="31" w:name="_Toc241504612"/>
       <w:r>
         <w:instrText>Gambar 2.3 Lima rute dengan delay rate tertinggi pada volume di atas 500 order</w:instrText>
       </w:r>
@@ -9366,7 +9310,7 @@
         <w:pStyle w:val="Heading2"/>
         <w:spacing w:before="0"/>
       </w:pPr>
-      <w:bookmarkStart w:id="32" w:name="_Toc241501784"/>
+      <w:bookmarkStart w:id="32" w:name="_Toc241504590"/>
       <w:r>
         <w:lastRenderedPageBreak/>
         <w:t>2.4 Justifikasi teknologi dan batas rancangan</w:t>
@@ -9400,7 +9344,7 @@
       <w:r>
         <w:instrText>TC "</w:instrText>
       </w:r>
-      <w:bookmarkStart w:id="33" w:name="_Toc241501810"/>
+      <w:bookmarkStart w:id="33" w:name="_Toc241504616"/>
       <w:r>
         <w:instrText>Tabel 2.3 Justifikasi dan alternatif teknologi pada scope proyek</w:instrText>
       </w:r>
@@ -10341,7 +10285,7 @@
           <w:szCs w:val="24"/>
         </w:rPr>
       </w:pPr>
-      <w:bookmarkStart w:id="34" w:name="_Toc241501785"/>
+      <w:bookmarkStart w:id="34" w:name="_Toc241504591"/>
       <w:r>
         <w:rPr>
           <w:rFonts w:ascii="Times New Roman" w:hAnsi="Times New Roman"/>
@@ -10388,7 +10332,7 @@
         </w:rPr>
       </w:pPr>
       <w:bookmarkStart w:id="35" w:name="_Toc241072610"/>
-      <w:bookmarkStart w:id="36" w:name="_Toc241501786"/>
+      <w:bookmarkStart w:id="36" w:name="_Toc241504592"/>
       <w:r>
         <w:rPr>
           <w:szCs w:val="24"/>
@@ -10508,7 +10452,7 @@
         </w:rPr>
       </w:pPr>
       <w:bookmarkStart w:id="37" w:name="_Toc241072611"/>
-      <w:bookmarkStart w:id="38" w:name="_Toc241501787"/>
+      <w:bookmarkStart w:id="38" w:name="_Toc241504593"/>
       <w:r>
         <w:rPr>
           <w:szCs w:val="24"/>
@@ -10627,7 +10571,7 @@
           <w:lang w:val="en-ID"/>
         </w:rPr>
       </w:pPr>
-      <w:bookmarkStart w:id="39" w:name="_Toc241501788"/>
+      <w:bookmarkStart w:id="39" w:name="_Toc241504594"/>
       <w:r>
         <w:t>3.3 Data Privacy dan perlindungan identitas</w:t>
       </w:r>
@@ -10686,7 +10630,7 @@
         </w:rPr>
       </w:pPr>
       <w:bookmarkStart w:id="40" w:name="_Toc241072613"/>
-      <w:bookmarkStart w:id="41" w:name="_Toc241501789"/>
+      <w:bookmarkStart w:id="41" w:name="_Toc241504595"/>
       <w:r>
         <w:rPr>
           <w:szCs w:val="24"/>
@@ -10798,7 +10742,7 @@
       <w:r>
         <w:instrText>TC "</w:instrText>
       </w:r>
-      <w:bookmarkStart w:id="42" w:name="_Toc241501811"/>
+      <w:bookmarkStart w:id="42" w:name="_Toc241504617"/>
       <w:r>
         <w:instrText>Tabel 3.1 Matriks Ringkasan Kerangka Kerja Tata Kelola IT (IT Governance Framework)</w:instrText>
       </w:r>
@@ -11388,7 +11332,7 @@
           <w:szCs w:val="24"/>
         </w:rPr>
       </w:pPr>
-      <w:bookmarkStart w:id="43" w:name="_Toc241501790"/>
+      <w:bookmarkStart w:id="43" w:name="_Toc241504596"/>
       <w:r>
         <w:rPr>
           <w:rFonts w:ascii="Times New Roman" w:hAnsi="Times New Roman"/>
@@ -11422,7 +11366,7 @@
         </w:rPr>
       </w:pPr>
       <w:bookmarkStart w:id="44" w:name="_Toc241072615"/>
-      <w:bookmarkStart w:id="45" w:name="_Toc241501791"/>
+      <w:bookmarkStart w:id="45" w:name="_Toc241504597"/>
       <w:r>
         <w:rPr>
           <w:szCs w:val="24"/>
@@ -11495,7 +11439,7 @@
       <w:r>
         <w:instrText>TC "</w:instrText>
       </w:r>
-      <w:bookmarkStart w:id="46" w:name="_Toc241501812"/>
+      <w:bookmarkStart w:id="46" w:name="_Toc241504618"/>
       <w:r>
         <w:instrText>Tabel 4.1 Inventarisasi Berkas Dataset Olist Store Brazil</w:instrText>
       </w:r>
@@ -12864,7 +12808,7 @@
         </w:rPr>
       </w:pPr>
       <w:bookmarkStart w:id="47" w:name="_Toc241072616"/>
-      <w:bookmarkStart w:id="48" w:name="_Toc241501792"/>
+      <w:bookmarkStart w:id="48" w:name="_Toc241504598"/>
       <w:r>
         <w:rPr>
           <w:szCs w:val="24"/>
@@ -12942,7 +12886,7 @@
       <w:r>
         <w:instrText>TC "</w:instrText>
       </w:r>
-      <w:bookmarkStart w:id="49" w:name="_Toc241501813"/>
+      <w:bookmarkStart w:id="49" w:name="_Toc241504619"/>
       <w:r>
         <w:instrText>Tabel 4.2 Grain dan key rancangan dimensional</w:instrText>
       </w:r>
@@ -13809,7 +13753,7 @@
           <w:lang w:val="en-ID"/>
         </w:rPr>
       </w:pPr>
-      <w:bookmarkStart w:id="50" w:name="_Toc241501793"/>
+      <w:bookmarkStart w:id="50" w:name="_Toc241504599"/>
       <w:r>
         <w:t>4.3 Pembersihan organisasi dan operasi data</w:t>
       </w:r>
@@ -13844,7 +13788,7 @@
         </w:rPr>
       </w:pPr>
       <w:bookmarkStart w:id="51" w:name="_Toc241072618"/>
-      <w:bookmarkStart w:id="52" w:name="_Toc241501794"/>
+      <w:bookmarkStart w:id="52" w:name="_Toc241504600"/>
       <w:r>
         <w:rPr>
           <w:rFonts w:ascii="Times New Roman" w:hAnsi="Times New Roman" w:cs="Times New Roman"/>
@@ -14006,7 +13950,7 @@
       <w:r>
         <w:instrText>TC "</w:instrText>
       </w:r>
-      <w:bookmarkStart w:id="53" w:name="_Toc241501814"/>
+      <w:bookmarkStart w:id="53" w:name="_Toc241504620"/>
       <w:r>
         <w:instrText>Tabel 4.3 Bukti persiapan data sebelum dan sesudah</w:instrText>
       </w:r>
@@ -14710,7 +14654,7 @@
           <w:lang w:val="en-ID"/>
         </w:rPr>
       </w:pPr>
-      <w:bookmarkStart w:id="54" w:name="_Toc241501795"/>
+      <w:bookmarkStart w:id="54" w:name="_Toc241504601"/>
       <w:r>
         <w:rPr>
           <w:rFonts w:ascii="Times New Roman" w:hAnsi="Times New Roman"/>
@@ -14812,7 +14756,7 @@
         </w:rPr>
       </w:pPr>
       <w:bookmarkStart w:id="55" w:name="_Toc241072620"/>
-      <w:bookmarkStart w:id="56" w:name="_Toc241501796"/>
+      <w:bookmarkStart w:id="56" w:name="_Toc241504602"/>
       <w:r>
         <w:rPr>
           <w:rFonts w:ascii="Times New Roman" w:hAnsi="Times New Roman" w:cs="Times New Roman"/>
@@ -14912,7 +14856,7 @@
       <w:r>
         <w:instrText>TC "</w:instrText>
       </w:r>
-      <w:bookmarkStart w:id="57" w:name="_Toc241501815"/>
+      <w:bookmarkStart w:id="57" w:name="_Toc241504621"/>
       <w:r>
         <w:instrText>Tabel 4.4 Pemetaan operasi data dan transformasi PySpark dan NetworkX</w:instrText>
       </w:r>
@@ -15620,7 +15564,7 @@
         </w:rPr>
       </w:pPr>
       <w:bookmarkStart w:id="58" w:name="_Toc241072634"/>
-      <w:bookmarkStart w:id="59" w:name="_Toc241501797"/>
+      <w:bookmarkStart w:id="59" w:name="_Toc241504603"/>
       <w:r>
         <w:rPr>
           <w:rFonts w:ascii="Times New Roman" w:hAnsi="Times New Roman" w:cs="Times New Roman"/>
@@ -15691,6 +15635,18 @@
           <w:sz w:val="21"/>
         </w:rPr>
         <w:t>Apache Spark. (2026d). Submitting Applications, Spark 4.0.4 documentation. https://spark.apache.org/docs/4.0.4/submitting-applications.html</w:t>
+      </w:r>
+    </w:p>
+    <w:p>
+      <w:pPr>
+        <w:spacing w:after="80" w:line="240" w:lineRule="auto"/>
+        <w:ind w:left="504" w:hanging="504"/>
+      </w:pPr>
+      <w:r>
+        <w:rPr>
+          <w:sz w:val="21"/>
+        </w:rPr>
+        <w:t>DHL Group. (2026, June 2). DHL E-Commerce Trends Report 2026: Old rules don't apply in the age of AI. https://group.dhl.com/en/media-relations/press-releases/2026/dhl-ecommerce-trends-report-2026-old-rules-do-not-apply-in-the-age-of-ai.html</w:t>
       </w:r>
     </w:p>
     <w:p>
@@ -15707,12 +15663,33 @@
       </w:pPr>
       <w:r>
         <w:rPr>
-          <w:rFonts w:cs="Times New Roman"/>
           <w:sz w:val="21"/>
-          <w:szCs w:val="24"/>
-          <w:lang w:val="en-ID"/>
-        </w:rPr>
-        <w:t>Armbrust, M., Ghodsi, A., Xin, R., &amp; Zaharia, M. (2021). Lakehouse: A new generation of open platforms that unify data warehousing and advanced analytics. Proceedings of the 11th Conference on Innovative Data Systems Research (CIDR).</w:t>
+        </w:rPr>
+        <w:t>Governo Federal do Brasil. (2018). Lei nº 13.709 de 14 de agosto de 2018, texto compilado. https://www.planalto.gov.br/ccivil_03/_ato2015-2018/2018/lei/l13709.htm</w:t>
+      </w:r>
+    </w:p>
+    <w:p>
+      <w:pPr>
+        <w:spacing w:after="80" w:line="240" w:lineRule="auto"/>
+        <w:ind w:left="504" w:hanging="504"/>
+      </w:pPr>
+      <w:r>
+        <w:rPr>
+          <w:sz w:val="21"/>
+        </w:rPr>
+        <w:t>Hasil eksekusi lokal. (2026). Notebook 01–03 dan artefak outputs_ml_graph, run tersimpan 28 September 2026. Statistik review dan key sumber diverifikasi kembali pada .report_review/independent_metrics.json.</w:t>
+      </w:r>
+    </w:p>
+    <w:p>
+      <w:pPr>
+        <w:spacing w:after="80" w:line="240" w:lineRule="auto"/>
+        <w:ind w:left="504" w:hanging="504"/>
+      </w:pPr>
+      <w:r>
+        <w:rPr>
+          <w:sz w:val="21"/>
+        </w:rPr>
+        <w:t>Kimball, R. (2008). Fact Tables. Kimball Group. https://www.kimballgroup.com/2008/11/fact-tables/</w:t>
       </w:r>
     </w:p>
     <w:p>
@@ -15734,7 +15711,31 @@
           <w:szCs w:val="24"/>
           <w:lang w:val="en-ID"/>
         </w:rPr>
-        <w:t>Chambers, B., &amp; Zaharia, M. (2018). Spark: The definitive guide - Big data processing made simple. O'Reilly Media.</w:t>
+        <w:t>Kimball, R., &amp; Ross, M. (2013). The data warehouse toolkit: The definitive guide to dimensional modeling (3rd ed.). John Wiley &amp; Sons.</w:t>
+      </w:r>
+    </w:p>
+    <w:p>
+      <w:pPr>
+        <w:spacing w:after="80" w:line="240" w:lineRule="auto"/>
+        <w:ind w:left="504" w:hanging="504"/>
+      </w:pPr>
+      <w:r>
+        <w:rPr>
+          <w:sz w:val="21"/>
+        </w:rPr>
+        <w:t>NetworkX Developers. (2026). Betweenness centrality documentation. https://networkx.org/documentation/stable/reference/algorithms/generated/networkx.algorithms.centrality.betweenness_centrality.html</w:t>
+      </w:r>
+    </w:p>
+    <w:p>
+      <w:pPr>
+        <w:spacing w:after="80" w:line="240" w:lineRule="auto"/>
+        <w:ind w:left="504" w:hanging="504"/>
+      </w:pPr>
+      <w:r>
+        <w:rPr>
+          <w:sz w:val="21"/>
+        </w:rPr>
+        <w:t>OECD. (2019). Unpacking E-commerce: Business Models, Trends and Policies. OECD Publishing. https://doi.org/10.1787/23561431-en</w:t>
       </w:r>
     </w:p>
     <w:p>
@@ -15756,259 +15757,19 @@
           <w:szCs w:val="24"/>
           <w:lang w:val="en-ID"/>
         </w:rPr>
-        <w:t>Ferrari, A., &amp; Russo, M. (2019). The definitive guide to DAX: Business intelligence with Microsoft Power BI, SQL Server Analysis Services, and Excel (2nd ed.). Microsoft Press.</w:t>
+        <w:t>Olist Store. (2018). Brazilian E-Commerce Public Dataset by Olist. Kaggle. https://www.kaggle.com/datasets/olistbr/brazilian-ecommerce</w:t>
       </w:r>
     </w:p>
     <w:p>
       <w:pPr>
         <w:spacing w:after="80" w:line="240" w:lineRule="auto"/>
         <w:ind w:left="504" w:hanging="504"/>
-        <w:rPr>
-          <w:rFonts w:cs="Times New Roman"/>
-          <w:color w:val="000000" w:themeColor="text1"/>
-          <w:sz w:val="24"/>
-          <w:szCs w:val="24"/>
-          <w:lang w:val="en-ID"/>
-        </w:rPr>
       </w:pPr>
       <w:r>
         <w:rPr>
           <w:sz w:val="21"/>
         </w:rPr>
-        <w:t>Governo Federal do Brasil. (2018). Lei nº 13.709 de 14 de agosto de 2018, texto compilado. https://www.planalto.gov.br/ccivil_03/_ato2015-2018/2018/lei/l13709.htm</w:t>
-      </w:r>
-    </w:p>
-    <w:p>
-      <w:pPr>
-        <w:spacing w:after="80" w:line="240" w:lineRule="auto"/>
-        <w:ind w:left="504" w:hanging="504"/>
-        <w:rPr>
-          <w:rFonts w:cs="Times New Roman"/>
-          <w:color w:val="000000" w:themeColor="text1"/>
-          <w:sz w:val="24"/>
-          <w:szCs w:val="24"/>
-          <w:lang w:val="en-ID"/>
-        </w:rPr>
-      </w:pPr>
-      <w:r>
-        <w:rPr>
-          <w:rFonts w:cs="Times New Roman"/>
-          <w:sz w:val="21"/>
-          <w:szCs w:val="24"/>
-          <w:lang w:val="en-ID"/>
-        </w:rPr>
-        <w:t>Hagberg, A. A., Schult, D. A., &amp; Swart, P. J. (2008). Exploring network structure, dynamics, and function using NetworkX. Proceedings of the 7th Python in Science Conference (SciPy), 11–15.</w:t>
-      </w:r>
-    </w:p>
-    <w:p>
-      <w:pPr>
-        <w:spacing w:after="80" w:line="240" w:lineRule="auto"/>
-        <w:ind w:left="504" w:hanging="504"/>
-      </w:pPr>
-      <w:r>
-        <w:rPr>
-          <w:sz w:val="21"/>
-        </w:rPr>
-        <w:t>Hasil eksekusi lokal. (2026). Notebook 01–03 dan artefak outputs_ml_graph, run tersimpan 28 September 2026. Statistik review dan key sumber diverifikasi kembali pada .report_review/independent_metrics.json.</w:t>
-      </w:r>
-    </w:p>
-    <w:p>
-      <w:pPr>
-        <w:spacing w:after="80" w:line="240" w:lineRule="auto"/>
-        <w:ind w:left="504" w:hanging="504"/>
-        <w:rPr>
-          <w:rFonts w:cs="Times New Roman"/>
-          <w:color w:val="000000" w:themeColor="text1"/>
-          <w:sz w:val="24"/>
-          <w:szCs w:val="24"/>
-          <w:lang w:val="en-ID"/>
-        </w:rPr>
-      </w:pPr>
-      <w:r>
-        <w:rPr>
-          <w:rFonts w:cs="Times New Roman"/>
-          <w:sz w:val="21"/>
-          <w:szCs w:val="24"/>
-          <w:lang w:val="en-ID"/>
-        </w:rPr>
-        <w:t>Inmon, W. H. (2005). Building the data warehouse (4th ed.). John Wiley &amp; Sons.</w:t>
-      </w:r>
-    </w:p>
-    <w:p>
-      <w:pPr>
-        <w:spacing w:after="80" w:line="240" w:lineRule="auto"/>
-        <w:ind w:left="504" w:hanging="504"/>
-      </w:pPr>
-      <w:r>
-        <w:rPr>
-          <w:sz w:val="21"/>
-        </w:rPr>
-        <w:t>Kimball, R. (2008). Fact Tables. Kimball Group. https://www.kimballgroup.com/2008/11/fact-tables/</w:t>
-      </w:r>
-    </w:p>
-    <w:p>
-      <w:pPr>
-        <w:spacing w:after="80" w:line="240" w:lineRule="auto"/>
-        <w:ind w:left="504" w:hanging="504"/>
-        <w:rPr>
-          <w:rFonts w:cs="Times New Roman"/>
-          <w:color w:val="000000" w:themeColor="text1"/>
-          <w:sz w:val="24"/>
-          <w:szCs w:val="24"/>
-          <w:lang w:val="en-ID"/>
-        </w:rPr>
-      </w:pPr>
-      <w:r>
-        <w:rPr>
-          <w:rFonts w:cs="Times New Roman"/>
-          <w:sz w:val="21"/>
-          <w:szCs w:val="24"/>
-          <w:lang w:val="en-ID"/>
-        </w:rPr>
-        <w:t>Kimball, R., &amp; Ross, M. (2013). The data warehouse toolkit: The definitive guide to dimensional modeling (3rd ed.). John Wiley &amp; Sons.</w:t>
-      </w:r>
-    </w:p>
-    <w:p>
-      <w:pPr>
-        <w:spacing w:after="80" w:line="240" w:lineRule="auto"/>
-        <w:ind w:left="504" w:hanging="504"/>
-        <w:rPr>
-          <w:rFonts w:cs="Times New Roman"/>
-          <w:color w:val="000000" w:themeColor="text1"/>
-          <w:sz w:val="24"/>
-          <w:szCs w:val="24"/>
-          <w:lang w:val="en-ID"/>
-        </w:rPr>
-      </w:pPr>
-      <w:r>
-        <w:rPr>
-          <w:rFonts w:cs="Times New Roman"/>
-          <w:sz w:val="21"/>
-          <w:szCs w:val="24"/>
-          <w:lang w:val="en-ID"/>
-        </w:rPr>
-        <w:t>Meng, X., Bradley, J., Yavuz, B., Sparks, E., Venkataraman, S., Liu, D., Freeman, J., Tsai, D., Amde, M., Owen, S., Xin, D., Xin, R., Franklin, M. J., Zadeh, R., Zaharia, M., &amp; Talwalkar, A. (2016). MLlib: Machine learning in Apache Spark. Journal of Machine Learning Research, 17(34), 1–7.</w:t>
-      </w:r>
-    </w:p>
-    <w:p>
-      <w:pPr>
-        <w:spacing w:after="80" w:line="240" w:lineRule="auto"/>
-        <w:ind w:left="504" w:hanging="504"/>
-      </w:pPr>
-      <w:r>
-        <w:rPr>
-          <w:sz w:val="21"/>
-        </w:rPr>
-        <w:t>NetworkX Developers. (2026). Betweenness centrality documentation. https://networkx.org/documentation/stable/reference/algorithms/generated/networkx.algorithms.centrality.betweenness_centrality.html</w:t>
-      </w:r>
-    </w:p>
-    <w:p>
-      <w:pPr>
-        <w:spacing w:after="80" w:line="240" w:lineRule="auto"/>
-        <w:ind w:left="504" w:hanging="504"/>
-        <w:rPr>
-          <w:rFonts w:cs="Times New Roman"/>
-          <w:color w:val="000000" w:themeColor="text1"/>
-          <w:sz w:val="24"/>
-          <w:szCs w:val="24"/>
-          <w:lang w:val="en-ID"/>
-        </w:rPr>
-      </w:pPr>
-      <w:r>
-        <w:rPr>
-          <w:rFonts w:cs="Times New Roman"/>
-          <w:sz w:val="21"/>
-          <w:szCs w:val="24"/>
-          <w:lang w:val="en-ID"/>
-        </w:rPr>
-        <w:t>Olist Store. (2018). Brazilian E-Commerce Public Dataset by Olist. Kaggle. https://www.kaggle.com/datasets/olistbr/brazilian-ecommerce</w:t>
-      </w:r>
-    </w:p>
-    <w:p>
-      <w:pPr>
-        <w:spacing w:after="80" w:line="240" w:lineRule="auto"/>
-        <w:ind w:left="504" w:hanging="504"/>
-      </w:pPr>
-      <w:r>
-        <w:rPr>
-          <w:sz w:val="21"/>
-        </w:rPr>
         <w:t>pandas Development Team. (2026). Scaling to large datasets. https://pandas.pydata.org/docs/user_guide/scale.html</w:t>
-      </w:r>
-    </w:p>
-    <w:p>
-      <w:pPr>
-        <w:spacing w:after="80" w:line="240" w:lineRule="auto"/>
-        <w:ind w:left="504" w:hanging="504"/>
-        <w:rPr>
-          <w:rFonts w:cs="Times New Roman"/>
-          <w:color w:val="000000" w:themeColor="text1"/>
-          <w:sz w:val="24"/>
-          <w:szCs w:val="24"/>
-          <w:lang w:val="en-ID"/>
-        </w:rPr>
-      </w:pPr>
-      <w:r>
-        <w:rPr>
-          <w:rFonts w:cs="Times New Roman"/>
-          <w:sz w:val="21"/>
-          <w:szCs w:val="24"/>
-          <w:lang w:val="en-ID"/>
-        </w:rPr>
-        <w:t>Vohra, D. (2016). Practical Apache Spark: Using the Scala API. Apress.</w:t>
-      </w:r>
-    </w:p>
-    <w:p>
-      <w:pPr>
-        <w:spacing w:after="80" w:line="240" w:lineRule="auto"/>
-        <w:ind w:left="504" w:hanging="504"/>
-        <w:rPr>
-          <w:rFonts w:cs="Times New Roman"/>
-          <w:color w:val="000000" w:themeColor="text1"/>
-          <w:sz w:val="24"/>
-          <w:szCs w:val="24"/>
-          <w:lang w:val="en-ID"/>
-        </w:rPr>
-      </w:pPr>
-      <w:r>
-        <w:rPr>
-          <w:rFonts w:cs="Times New Roman"/>
-          <w:sz w:val="21"/>
-          <w:szCs w:val="24"/>
-          <w:lang w:val="en-ID"/>
-        </w:rPr>
-        <w:t>Widianty, W. (2015). Data warehouse design with Kimball method: Case study of Fahrenheit Manufacturing Systems. ComTech: Computer, Mathematics and Engineering Applications, 6(4), 604-612.</w:t>
-      </w:r>
-    </w:p>
-    <w:p>
-      <w:pPr>
-        <w:spacing w:after="80" w:line="240" w:lineRule="auto"/>
-        <w:ind w:left="504" w:hanging="504"/>
-        <w:rPr>
-          <w:rFonts w:cs="Times New Roman"/>
-          <w:color w:val="000000" w:themeColor="text1"/>
-          <w:sz w:val="24"/>
-          <w:szCs w:val="24"/>
-          <w:lang w:val="en-ID"/>
-        </w:rPr>
-      </w:pPr>
-      <w:r>
-        <w:rPr>
-          <w:rFonts w:cs="Times New Roman"/>
-          <w:sz w:val="21"/>
-          <w:szCs w:val="24"/>
-          <w:lang w:val="en-ID"/>
-        </w:rPr>
-        <w:t>Zahra, A., &amp; Astriani, M. S. (2026). Lecture notes: Big Data Analytics (COMP8035041) - Session 1 to Session 9. Universitas Bina Nusantara</w:t>
-      </w:r>
-      <w:r>
-        <w:rPr>
-          <w:rFonts w:cs="Times New Roman"/>
-          <w:sz w:val="21"/>
-          <w:szCs w:val="24"/>
-          <w:lang w:val="en-ID"/>
-        </w:rPr>
-        <w:t>.</w:t>
       </w:r>
     </w:p>
     <w:p>
@@ -16026,7 +15787,7 @@
         </w:rPr>
       </w:pPr>
       <w:bookmarkStart w:id="60" w:name="_Toc241072635"/>
-      <w:bookmarkStart w:id="61" w:name="_Toc241501798"/>
+      <w:bookmarkStart w:id="61" w:name="_Toc241504604"/>
       <w:r>
         <w:rPr>
           <w:rFonts w:ascii="Times New Roman" w:hAnsi="Times New Roman" w:cs="Times New Roman"/>
@@ -16405,7 +16166,7 @@
         </w:rPr>
       </w:pPr>
       <w:bookmarkStart w:id="62" w:name="_Toc241072636"/>
-      <w:bookmarkStart w:id="63" w:name="_Toc241501799"/>
+      <w:bookmarkStart w:id="63" w:name="_Toc241504605"/>
       <w:r>
         <w:rPr>
           <w:rFonts w:ascii="Times New Roman" w:hAnsi="Times New Roman" w:cs="Times New Roman"/>
@@ -16440,7 +16201,7 @@
           <w:lang w:val="en-ID"/>
         </w:rPr>
       </w:pPr>
-      <w:bookmarkStart w:id="64" w:name="_Toc241501800"/>
+      <w:bookmarkStart w:id="64" w:name="_Toc241504606"/>
       <w:r>
         <w:t>Lampiran A Berkas eksekusi dan bukti hasil</w:t>
       </w:r>
@@ -16464,7 +16225,7 @@
       <w:r>
         <w:instrText>TC "</w:instrText>
       </w:r>
-      <w:bookmarkStart w:id="65" w:name="_Toc241501816"/>
+      <w:bookmarkStart w:id="65" w:name="_Toc241504622"/>
       <w:r>
         <w:instrText>Tabel A.1 Manifest notebook dan keluaran</w:instrText>
       </w:r>
@@ -16861,7 +16622,7 @@
           <w:lang w:val="en-ID"/>
         </w:rPr>
       </w:pPr>
-      <w:bookmarkStart w:id="66" w:name="_Toc241501801"/>
+      <w:bookmarkStart w:id="66" w:name="_Toc241504607"/>
       <w:r>
         <w:t>Lampiran B Reproduksibilitas</w:t>
       </w:r>
@@ -16886,7 +16647,7 @@
           <w:lang w:val="en-ID"/>
         </w:rPr>
       </w:pPr>
-      <w:bookmarkStart w:id="67" w:name="_Toc241501802"/>
+      <w:bookmarkStart w:id="67" w:name="_Toc241504608"/>
       <w:r>
         <w:t>Lampiran C Keterbatasan studi</w:t>
       </w:r>
@@ -17171,9 +16932,6 @@
         <w:gridCol w:w="7381"/>
       </w:tblGrid>
       <w:tr>
-        <w:trPr>
-          <w:trHeight w:val="575"/>
-        </w:trPr>
         <w:tc>
           <w:tcPr>
             <w:tcW w:w="2088" w:type="dxa"/>
@@ -17185,7 +16943,6 @@
               <w:autoSpaceDN w:val="0"/>
               <w:spacing w:before="121" w:after="0" w:line="240" w:lineRule="auto"/>
               <w:ind w:left="107"/>
-              <w:jc w:val="both"/>
               <w:rPr>
                 <w:rFonts w:eastAsia="Times New Roman" w:cs="Times New Roman"/>
               </w:rPr>
@@ -17194,6 +16951,7 @@
               <w:rPr>
                 <w:rFonts w:eastAsia="Times New Roman" w:cs="Times New Roman"/>
                 <w:spacing w:val="-4"/>
+                <w:sz w:val="20"/>
               </w:rPr>
               <w:t>Name</w:t>
             </w:r>
@@ -17210,7 +16968,6 @@
               <w:autoSpaceDN w:val="0"/>
               <w:spacing w:before="121" w:after="0" w:line="240" w:lineRule="auto"/>
               <w:ind w:left="108"/>
-              <w:jc w:val="both"/>
               <w:rPr>
                 <w:rFonts w:eastAsia="Times New Roman" w:cs="Times New Roman"/>
               </w:rPr>
@@ -17219,6 +16976,7 @@
               <w:rPr>
                 <w:rFonts w:eastAsia="Times New Roman" w:cs="Times New Roman"/>
                 <w:spacing w:val="-10"/>
+                <w:sz w:val="20"/>
               </w:rPr>
               <w:t>:</w:t>
             </w:r>
@@ -17226,6 +16984,7 @@
               <w:rPr>
                 <w:rFonts w:eastAsia="Times New Roman" w:cs="Times New Roman"/>
                 <w:spacing w:val="-10"/>
+                <w:sz w:val="20"/>
               </w:rPr>
               <w:t xml:space="preserve"> YANLIS ALIM SANG PUTRA LASE</w:t>
             </w:r>
@@ -17233,9 +16992,6 @@
         </w:tc>
       </w:tr>
       <w:tr>
-        <w:trPr>
-          <w:trHeight w:val="577"/>
-        </w:trPr>
         <w:tc>
           <w:tcPr>
             <w:tcW w:w="2088" w:type="dxa"/>
@@ -17247,7 +17003,6 @@
               <w:autoSpaceDN w:val="0"/>
               <w:spacing w:before="123" w:after="0" w:line="240" w:lineRule="auto"/>
               <w:ind w:left="107"/>
-              <w:jc w:val="both"/>
               <w:rPr>
                 <w:rFonts w:eastAsia="Times New Roman" w:cs="Times New Roman"/>
               </w:rPr>
@@ -17255,6 +17010,7 @@
             <w:r>
               <w:rPr>
                 <w:rFonts w:eastAsia="Times New Roman" w:cs="Times New Roman"/>
+                <w:sz w:val="20"/>
               </w:rPr>
               <w:t>Student</w:t>
             </w:r>
@@ -17262,6 +17018,7 @@
               <w:rPr>
                 <w:rFonts w:eastAsia="Times New Roman" w:cs="Times New Roman"/>
                 <w:spacing w:val="-2"/>
+                <w:sz w:val="20"/>
               </w:rPr>
               <w:t xml:space="preserve"> </w:t>
             </w:r>
@@ -17269,6 +17026,7 @@
               <w:rPr>
                 <w:rFonts w:eastAsia="Times New Roman" w:cs="Times New Roman"/>
                 <w:spacing w:val="-5"/>
+                <w:sz w:val="20"/>
               </w:rPr>
               <w:t>ID</w:t>
             </w:r>
@@ -17285,7 +17043,6 @@
               <w:autoSpaceDN w:val="0"/>
               <w:spacing w:before="123" w:after="0" w:line="240" w:lineRule="auto"/>
               <w:ind w:left="108"/>
-              <w:jc w:val="both"/>
               <w:rPr>
                 <w:rFonts w:eastAsia="Times New Roman" w:cs="Times New Roman"/>
               </w:rPr>
@@ -17294,6 +17051,7 @@
               <w:rPr>
                 <w:rFonts w:eastAsia="Times New Roman" w:cs="Times New Roman"/>
                 <w:spacing w:val="-10"/>
+                <w:sz w:val="20"/>
               </w:rPr>
               <w:t>:</w:t>
             </w:r>
@@ -17301,6 +17059,7 @@
               <w:rPr>
                 <w:rFonts w:eastAsia="Times New Roman" w:cs="Times New Roman"/>
                 <w:spacing w:val="-10"/>
+                <w:sz w:val="20"/>
               </w:rPr>
               <w:t xml:space="preserve"> 2702751284</w:t>
             </w:r>
@@ -17308,9 +17067,6 @@
         </w:tc>
       </w:tr>
       <w:tr>
-        <w:trPr>
-          <w:trHeight w:val="575"/>
-        </w:trPr>
         <w:tc>
           <w:tcPr>
             <w:tcW w:w="2088" w:type="dxa"/>
@@ -17322,7 +17078,6 @@
               <w:autoSpaceDN w:val="0"/>
               <w:spacing w:before="121" w:after="0" w:line="240" w:lineRule="auto"/>
               <w:ind w:left="107"/>
-              <w:jc w:val="both"/>
               <w:rPr>
                 <w:rFonts w:eastAsia="Times New Roman" w:cs="Times New Roman"/>
               </w:rPr>
@@ -17330,6 +17085,7 @@
             <w:r>
               <w:rPr>
                 <w:rFonts w:eastAsia="Times New Roman" w:cs="Times New Roman"/>
+                <w:sz w:val="20"/>
               </w:rPr>
               <w:t>Course</w:t>
             </w:r>
@@ -17337,6 +17093,7 @@
               <w:rPr>
                 <w:rFonts w:eastAsia="Times New Roman" w:cs="Times New Roman"/>
                 <w:spacing w:val="-3"/>
+                <w:sz w:val="20"/>
               </w:rPr>
               <w:t xml:space="preserve"> </w:t>
             </w:r>
@@ -17344,6 +17101,7 @@
               <w:rPr>
                 <w:rFonts w:eastAsia="Times New Roman" w:cs="Times New Roman"/>
                 <w:spacing w:val="-4"/>
+                <w:sz w:val="20"/>
               </w:rPr>
               <w:t>Code</w:t>
             </w:r>
@@ -17360,7 +17118,6 @@
               <w:autoSpaceDN w:val="0"/>
               <w:spacing w:before="121" w:after="0" w:line="240" w:lineRule="auto"/>
               <w:ind w:left="108"/>
-              <w:jc w:val="both"/>
               <w:rPr>
                 <w:rFonts w:eastAsia="Times New Roman" w:cs="Times New Roman"/>
               </w:rPr>
@@ -17369,6 +17126,7 @@
               <w:rPr>
                 <w:rFonts w:eastAsia="Times New Roman" w:cs="Times New Roman"/>
                 <w:spacing w:val="-10"/>
+                <w:sz w:val="20"/>
               </w:rPr>
               <w:t>:</w:t>
             </w:r>
@@ -17376,6 +17134,7 @@
               <w:rPr>
                 <w:rFonts w:eastAsia="Times New Roman" w:cs="Times New Roman"/>
                 <w:spacing w:val="-10"/>
+                <w:sz w:val="20"/>
               </w:rPr>
               <w:t xml:space="preserve"> </w:t>
             </w:r>
@@ -17383,6 +17142,7 @@
               <w:rPr>
                 <w:rFonts w:eastAsia="Times New Roman" w:cs="Times New Roman"/>
                 <w:spacing w:val="-10"/>
+                <w:sz w:val="20"/>
               </w:rPr>
               <w:t>COMP8035041</w:t>
             </w:r>
@@ -17390,9 +17150,6 @@
         </w:tc>
       </w:tr>
       <w:tr>
-        <w:trPr>
-          <w:trHeight w:val="576"/>
-        </w:trPr>
         <w:tc>
           <w:tcPr>
             <w:tcW w:w="2088" w:type="dxa"/>
@@ -17404,7 +17161,6 @@
               <w:autoSpaceDN w:val="0"/>
               <w:spacing w:before="121" w:after="0" w:line="240" w:lineRule="auto"/>
               <w:ind w:left="107"/>
-              <w:jc w:val="both"/>
               <w:rPr>
                 <w:rFonts w:eastAsia="Times New Roman" w:cs="Times New Roman"/>
               </w:rPr>
@@ -17412,6 +17168,7 @@
             <w:r>
               <w:rPr>
                 <w:rFonts w:eastAsia="Times New Roman" w:cs="Times New Roman"/>
+                <w:sz w:val="20"/>
               </w:rPr>
               <w:t>Course</w:t>
             </w:r>
@@ -17419,6 +17176,7 @@
               <w:rPr>
                 <w:rFonts w:eastAsia="Times New Roman" w:cs="Times New Roman"/>
                 <w:spacing w:val="-1"/>
+                <w:sz w:val="20"/>
               </w:rPr>
               <w:t xml:space="preserve"> </w:t>
             </w:r>
@@ -17426,6 +17184,7 @@
               <w:rPr>
                 <w:rFonts w:eastAsia="Times New Roman" w:cs="Times New Roman"/>
                 <w:spacing w:val="-2"/>
+                <w:sz w:val="20"/>
               </w:rPr>
               <w:t>Title</w:t>
             </w:r>
@@ -17442,7 +17201,6 @@
               <w:autoSpaceDN w:val="0"/>
               <w:spacing w:before="121" w:after="0" w:line="240" w:lineRule="auto"/>
               <w:ind w:left="108"/>
-              <w:jc w:val="both"/>
               <w:rPr>
                 <w:rFonts w:eastAsia="Times New Roman" w:cs="Times New Roman"/>
               </w:rPr>
@@ -17451,6 +17209,7 @@
               <w:rPr>
                 <w:rFonts w:eastAsia="Times New Roman" w:cs="Times New Roman"/>
                 <w:spacing w:val="-10"/>
+                <w:sz w:val="20"/>
               </w:rPr>
               <w:t>:</w:t>
             </w:r>
@@ -17458,6 +17217,7 @@
               <w:rPr>
                 <w:rFonts w:eastAsia="Times New Roman" w:cs="Times New Roman"/>
                 <w:spacing w:val="-10"/>
+                <w:sz w:val="20"/>
               </w:rPr>
               <w:t xml:space="preserve"> </w:t>
             </w:r>
@@ -17465,6 +17225,7 @@
               <w:rPr>
                 <w:rFonts w:eastAsia="Times New Roman" w:cs="Times New Roman"/>
                 <w:spacing w:val="-10"/>
+                <w:sz w:val="20"/>
               </w:rPr>
               <w:t>Big Data Analytics</w:t>
             </w:r>
@@ -17472,9 +17233,6 @@
         </w:tc>
       </w:tr>
       <w:tr>
-        <w:trPr>
-          <w:trHeight w:val="575"/>
-        </w:trPr>
         <w:tc>
           <w:tcPr>
             <w:tcW w:w="2088" w:type="dxa"/>
@@ -17486,7 +17244,6 @@
               <w:autoSpaceDN w:val="0"/>
               <w:spacing w:before="121" w:after="0" w:line="240" w:lineRule="auto"/>
               <w:ind w:left="107"/>
-              <w:jc w:val="both"/>
               <w:rPr>
                 <w:rFonts w:eastAsia="Times New Roman" w:cs="Times New Roman"/>
               </w:rPr>
@@ -17494,6 +17251,7 @@
             <w:r>
               <w:rPr>
                 <w:rFonts w:eastAsia="Times New Roman" w:cs="Times New Roman"/>
+                <w:sz w:val="20"/>
               </w:rPr>
               <w:t>Assignment</w:t>
             </w:r>
@@ -17501,6 +17259,7 @@
               <w:rPr>
                 <w:rFonts w:eastAsia="Times New Roman" w:cs="Times New Roman"/>
                 <w:spacing w:val="-9"/>
+                <w:sz w:val="20"/>
               </w:rPr>
               <w:t xml:space="preserve"> </w:t>
             </w:r>
@@ -17508,6 +17267,7 @@
               <w:rPr>
                 <w:rFonts w:eastAsia="Times New Roman" w:cs="Times New Roman"/>
                 <w:spacing w:val="-4"/>
+                <w:sz w:val="20"/>
               </w:rPr>
               <w:t>Title</w:t>
             </w:r>
@@ -17524,7 +17284,6 @@
               <w:autoSpaceDN w:val="0"/>
               <w:spacing w:before="121" w:after="0" w:line="240" w:lineRule="auto"/>
               <w:ind w:left="108"/>
-              <w:jc w:val="both"/>
               <w:rPr>
                 <w:rFonts w:eastAsia="Times New Roman" w:cs="Times New Roman"/>
               </w:rPr>
@@ -17533,6 +17292,7 @@
               <w:rPr>
                 <w:rFonts w:eastAsia="Times New Roman" w:cs="Times New Roman"/>
                 <w:spacing w:val="-10"/>
+                <w:sz w:val="20"/>
               </w:rPr>
               <w:t>:</w:t>
             </w:r>
@@ -17540,6 +17300,7 @@
               <w:rPr>
                 <w:rFonts w:eastAsia="Times New Roman" w:cs="Times New Roman"/>
                 <w:spacing w:val="-10"/>
+                <w:sz w:val="20"/>
               </w:rPr>
               <w:t xml:space="preserve"> </w:t>
             </w:r>
@@ -17547,6 +17308,7 @@
               <w:rPr>
                 <w:rFonts w:eastAsia="Times New Roman" w:cs="Times New Roman"/>
                 <w:spacing w:val="-10"/>
+                <w:sz w:val="20"/>
               </w:rPr>
               <w:t>PENENTUAN STUDI KASUS, PERSIAPAN DATA, DAN RANCANGAN SOLUSI BIG DATA DENGAN PYSPARK MLlib DAN GRAPH ANALYTICS PADA OLIST STORE BRAZIL</w:t>
             </w:r>
@@ -17554,9 +17316,6 @@
         </w:tc>
       </w:tr>
       <w:tr>
-        <w:trPr>
-          <w:trHeight w:val="575"/>
-        </w:trPr>
         <w:tc>
           <w:tcPr>
             <w:tcW w:w="2088" w:type="dxa"/>
@@ -17568,7 +17327,6 @@
               <w:autoSpaceDN w:val="0"/>
               <w:spacing w:before="121" w:after="0" w:line="240" w:lineRule="auto"/>
               <w:ind w:left="107"/>
-              <w:jc w:val="both"/>
               <w:rPr>
                 <w:rFonts w:eastAsia="Times New Roman" w:cs="Times New Roman"/>
               </w:rPr>
@@ -17576,6 +17334,7 @@
             <w:r>
               <w:rPr>
                 <w:rFonts w:eastAsia="Times New Roman" w:cs="Times New Roman"/>
+                <w:sz w:val="20"/>
               </w:rPr>
               <w:t>Assignment</w:t>
             </w:r>
@@ -17583,6 +17342,7 @@
               <w:rPr>
                 <w:rFonts w:eastAsia="Times New Roman" w:cs="Times New Roman"/>
                 <w:spacing w:val="-7"/>
+                <w:sz w:val="20"/>
               </w:rPr>
               <w:t xml:space="preserve"> </w:t>
             </w:r>
@@ -17590,6 +17350,7 @@
               <w:rPr>
                 <w:rFonts w:eastAsia="Times New Roman" w:cs="Times New Roman"/>
                 <w:spacing w:val="-4"/>
+                <w:sz w:val="20"/>
               </w:rPr>
               <w:t>Type</w:t>
             </w:r>
@@ -17606,7 +17367,6 @@
               <w:autoSpaceDN w:val="0"/>
               <w:spacing w:before="121" w:after="0" w:line="240" w:lineRule="auto"/>
               <w:ind w:left="108"/>
-              <w:jc w:val="both"/>
               <w:rPr>
                 <w:rFonts w:eastAsia="Times New Roman" w:cs="Times New Roman"/>
               </w:rPr>
@@ -17615,6 +17375,7 @@
               <w:rPr>
                 <w:rFonts w:eastAsia="Times New Roman" w:cs="Times New Roman"/>
                 <w:strike/>
+                <w:sz w:val="20"/>
               </w:rPr>
               <w:t>Type</w:t>
             </w:r>
@@ -17623,6 +17384,7 @@
                 <w:rFonts w:eastAsia="Times New Roman" w:cs="Times New Roman"/>
                 <w:strike/>
                 <w:spacing w:val="-1"/>
+                <w:sz w:val="20"/>
               </w:rPr>
               <w:t xml:space="preserve"> </w:t>
             </w:r>
@@ -17630,6 +17392,7 @@
               <w:rPr>
                 <w:rFonts w:eastAsia="Times New Roman" w:cs="Times New Roman"/>
                 <w:strike/>
+                <w:sz w:val="20"/>
               </w:rPr>
               <w:t>1/</w:t>
             </w:r>
@@ -17638,12 +17401,14 @@
                 <w:rFonts w:eastAsia="Times New Roman" w:cs="Times New Roman"/>
                 <w:strike/>
                 <w:spacing w:val="-2"/>
+                <w:sz w:val="20"/>
               </w:rPr>
               <w:t xml:space="preserve"> </w:t>
             </w:r>
             <w:r>
               <w:rPr>
                 <w:rFonts w:eastAsia="Times New Roman" w:cs="Times New Roman"/>
+                <w:sz w:val="20"/>
               </w:rPr>
               <w:t>Type</w:t>
             </w:r>
@@ -17651,12 +17416,14 @@
               <w:rPr>
                 <w:rFonts w:eastAsia="Times New Roman" w:cs="Times New Roman"/>
                 <w:spacing w:val="-1"/>
+                <w:sz w:val="20"/>
               </w:rPr>
               <w:t xml:space="preserve"> </w:t>
             </w:r>
             <w:r>
               <w:rPr>
                 <w:rFonts w:eastAsia="Times New Roman" w:cs="Times New Roman"/>
+                <w:sz w:val="20"/>
               </w:rPr>
               <w:t>2</w:t>
             </w:r>
@@ -17665,6 +17432,7 @@
                 <w:rFonts w:eastAsia="Times New Roman" w:cs="Times New Roman"/>
                 <w:strike/>
                 <w:spacing w:val="-2"/>
+                <w:sz w:val="20"/>
               </w:rPr>
               <w:t xml:space="preserve"> </w:t>
             </w:r>
@@ -17672,6 +17440,7 @@
               <w:rPr>
                 <w:rFonts w:eastAsia="Times New Roman" w:cs="Times New Roman"/>
                 <w:strike/>
+                <w:sz w:val="20"/>
               </w:rPr>
               <w:t>/</w:t>
             </w:r>
@@ -17680,6 +17449,7 @@
                 <w:rFonts w:eastAsia="Times New Roman" w:cs="Times New Roman"/>
                 <w:strike/>
                 <w:spacing w:val="-1"/>
+                <w:sz w:val="20"/>
               </w:rPr>
               <w:t xml:space="preserve"> </w:t>
             </w:r>
@@ -17687,6 +17457,7 @@
               <w:rPr>
                 <w:rFonts w:eastAsia="Times New Roman" w:cs="Times New Roman"/>
                 <w:strike/>
+                <w:sz w:val="20"/>
               </w:rPr>
               <w:t>Type</w:t>
             </w:r>
@@ -17695,6 +17466,7 @@
                 <w:rFonts w:eastAsia="Times New Roman" w:cs="Times New Roman"/>
                 <w:strike/>
                 <w:spacing w:val="-1"/>
+                <w:sz w:val="20"/>
               </w:rPr>
               <w:t xml:space="preserve"> </w:t>
             </w:r>
@@ -17702,6 +17474,7 @@
               <w:rPr>
                 <w:rFonts w:eastAsia="Times New Roman" w:cs="Times New Roman"/>
                 <w:strike/>
+                <w:sz w:val="20"/>
               </w:rPr>
               <w:t>3</w:t>
             </w:r>
@@ -17710,6 +17483,7 @@
                 <w:rFonts w:eastAsia="Times New Roman" w:cs="Times New Roman"/>
                 <w:strike/>
                 <w:spacing w:val="-2"/>
+                <w:sz w:val="20"/>
               </w:rPr>
               <w:t xml:space="preserve"> </w:t>
             </w:r>
@@ -17717,6 +17491,7 @@
               <w:rPr>
                 <w:rFonts w:eastAsia="Times New Roman" w:cs="Times New Roman"/>
                 <w:strike/>
+                <w:sz w:val="20"/>
               </w:rPr>
               <w:t>/</w:t>
             </w:r>
@@ -17725,6 +17500,7 @@
                 <w:rFonts w:eastAsia="Times New Roman" w:cs="Times New Roman"/>
                 <w:strike/>
                 <w:spacing w:val="-1"/>
+                <w:sz w:val="20"/>
               </w:rPr>
               <w:t xml:space="preserve"> </w:t>
             </w:r>
@@ -17732,6 +17508,7 @@
               <w:rPr>
                 <w:rFonts w:eastAsia="Times New Roman" w:cs="Times New Roman"/>
                 <w:strike/>
+                <w:sz w:val="20"/>
               </w:rPr>
               <w:t>Type</w:t>
             </w:r>
@@ -17740,6 +17517,7 @@
                 <w:rFonts w:eastAsia="Times New Roman" w:cs="Times New Roman"/>
                 <w:strike/>
                 <w:spacing w:val="-1"/>
+                <w:sz w:val="20"/>
               </w:rPr>
               <w:t xml:space="preserve"> </w:t>
             </w:r>
@@ -17747,6 +17525,7 @@
               <w:rPr>
                 <w:rFonts w:eastAsia="Times New Roman" w:cs="Times New Roman"/>
                 <w:strike/>
+                <w:sz w:val="20"/>
               </w:rPr>
               <w:t>4</w:t>
             </w:r>
@@ -17755,6 +17534,7 @@
                 <w:rFonts w:eastAsia="Times New Roman" w:cs="Times New Roman"/>
                 <w:strike/>
                 <w:spacing w:val="-1"/>
+                <w:sz w:val="20"/>
               </w:rPr>
               <w:t xml:space="preserve"> </w:t>
             </w:r>
@@ -17762,6 +17542,7 @@
               <w:rPr>
                 <w:rFonts w:eastAsia="Times New Roman" w:cs="Times New Roman"/>
                 <w:strike/>
+                <w:sz w:val="20"/>
               </w:rPr>
               <w:t>/</w:t>
             </w:r>
@@ -17770,6 +17551,7 @@
                 <w:rFonts w:eastAsia="Times New Roman" w:cs="Times New Roman"/>
                 <w:strike/>
                 <w:spacing w:val="-2"/>
+                <w:sz w:val="20"/>
               </w:rPr>
               <w:t xml:space="preserve"> </w:t>
             </w:r>
@@ -17777,6 +17559,7 @@
               <w:rPr>
                 <w:rFonts w:eastAsia="Times New Roman" w:cs="Times New Roman"/>
                 <w:strike/>
+                <w:sz w:val="20"/>
               </w:rPr>
               <w:t>Type</w:t>
             </w:r>
@@ -17785,6 +17568,7 @@
                 <w:rFonts w:eastAsia="Times New Roman" w:cs="Times New Roman"/>
                 <w:strike/>
                 <w:spacing w:val="-1"/>
+                <w:sz w:val="20"/>
               </w:rPr>
               <w:t xml:space="preserve"> </w:t>
             </w:r>
@@ -17792,6 +17576,7 @@
               <w:rPr>
                 <w:rFonts w:eastAsia="Times New Roman" w:cs="Times New Roman"/>
                 <w:strike/>
+                <w:sz w:val="20"/>
               </w:rPr>
               <w:t>5</w:t>
             </w:r>
@@ -18134,9 +17919,6 @@
         <w:gridCol w:w="3493"/>
       </w:tblGrid>
       <w:tr>
-        <w:trPr>
-          <w:trHeight w:val="470"/>
-        </w:trPr>
         <w:tc>
           <w:tcPr>
             <w:tcW w:w="2268" w:type="dxa"/>
@@ -18148,7 +17930,6 @@
               <w:autoSpaceDN w:val="0"/>
               <w:spacing w:before="122" w:after="0" w:line="240" w:lineRule="auto"/>
               <w:ind w:left="209"/>
-              <w:jc w:val="both"/>
               <w:rPr>
                 <w:rFonts w:eastAsia="Times New Roman" w:cs="Times New Roman"/>
                 <w:sz w:val="20"/>
@@ -18191,7 +17972,6 @@
               <w:autoSpaceDN w:val="0"/>
               <w:spacing w:before="122" w:after="0" w:line="240" w:lineRule="auto"/>
               <w:ind w:left="6"/>
-              <w:jc w:val="both"/>
               <w:rPr>
                 <w:rFonts w:eastAsia="Times New Roman" w:cs="Times New Roman"/>
                 <w:sz w:val="20"/>
@@ -18248,7 +18028,6 @@
               <w:autoSpaceDN w:val="0"/>
               <w:spacing w:before="122" w:after="0" w:line="240" w:lineRule="auto"/>
               <w:ind w:left="601"/>
-              <w:jc w:val="both"/>
               <w:rPr>
                 <w:rFonts w:eastAsia="Times New Roman" w:cs="Times New Roman"/>
                 <w:sz w:val="20"/>
@@ -18290,7 +18069,6 @@
               <w:autoSpaceDN w:val="0"/>
               <w:spacing w:before="122" w:after="0" w:line="240" w:lineRule="auto"/>
               <w:ind w:left="837"/>
-              <w:jc w:val="both"/>
               <w:rPr>
                 <w:rFonts w:eastAsia="Times New Roman" w:cs="Times New Roman"/>
                 <w:sz w:val="20"/>
@@ -18323,9 +18101,6 @@
         </w:tc>
       </w:tr>
       <w:tr>
-        <w:trPr>
-          <w:trHeight w:val="700"/>
-        </w:trPr>
         <w:tc>
           <w:tcPr>
             <w:tcW w:w="2268" w:type="dxa"/>
@@ -18337,7 +18112,6 @@
               <w:autoSpaceDN w:val="0"/>
               <w:spacing w:before="120" w:after="0" w:line="240" w:lineRule="auto"/>
               <w:ind w:left="107" w:right="213"/>
-              <w:jc w:val="both"/>
               <w:rPr>
                 <w:rFonts w:eastAsia="Times New Roman" w:cs="Times New Roman"/>
                 <w:sz w:val="20"/>
@@ -18416,7 +18190,6 @@
               <w:autoSpaceDN w:val="0"/>
               <w:spacing w:before="122" w:after="0" w:line="240" w:lineRule="auto"/>
               <w:ind w:left="6" w:right="3"/>
-              <w:jc w:val="both"/>
               <w:rPr>
                 <w:rFonts w:eastAsia="Times New Roman" w:cs="Times New Roman"/>
                 <w:sz w:val="20"/>
@@ -18442,7 +18215,6 @@
               <w:autoSpaceDE w:val="0"/>
               <w:autoSpaceDN w:val="0"/>
               <w:spacing w:after="0" w:line="240" w:lineRule="auto"/>
-              <w:jc w:val="both"/>
               <w:rPr>
                 <w:rFonts w:eastAsia="Times New Roman" w:cs="Times New Roman"/>
                 <w:sz w:val="20"/>
@@ -18467,7 +18239,6 @@
               <w:autoSpaceDE w:val="0"/>
               <w:autoSpaceDN w:val="0"/>
               <w:spacing w:after="0" w:line="240" w:lineRule="auto"/>
-              <w:jc w:val="both"/>
               <w:rPr>
                 <w:rFonts w:eastAsia="Times New Roman" w:cs="Times New Roman"/>
                 <w:sz w:val="20"/>
@@ -18484,9 +18255,6 @@
         </w:tc>
       </w:tr>
       <w:tr>
-        <w:trPr>
-          <w:trHeight w:val="470"/>
-        </w:trPr>
         <w:tc>
           <w:tcPr>
             <w:tcW w:w="2268" w:type="dxa"/>
@@ -18498,7 +18266,6 @@
               <w:autoSpaceDN w:val="0"/>
               <w:spacing w:before="120" w:after="0" w:line="240" w:lineRule="auto"/>
               <w:ind w:left="107"/>
-              <w:jc w:val="both"/>
               <w:rPr>
                 <w:rFonts w:eastAsia="Times New Roman" w:cs="Times New Roman"/>
                 <w:sz w:val="20"/>
@@ -18540,7 +18307,6 @@
               <w:autoSpaceDN w:val="0"/>
               <w:spacing w:before="120" w:after="0" w:line="240" w:lineRule="auto"/>
               <w:ind w:left="6" w:right="3"/>
-              <w:jc w:val="both"/>
               <w:rPr>
                 <w:rFonts w:eastAsia="Times New Roman" w:cs="Times New Roman"/>
                 <w:sz w:val="20"/>
@@ -18566,7 +18332,6 @@
               <w:autoSpaceDE w:val="0"/>
               <w:autoSpaceDN w:val="0"/>
               <w:spacing w:after="0" w:line="240" w:lineRule="auto"/>
-              <w:jc w:val="both"/>
               <w:rPr>
                 <w:rFonts w:eastAsia="Times New Roman" w:cs="Times New Roman"/>
                 <w:sz w:val="20"/>
@@ -18591,7 +18356,6 @@
               <w:autoSpaceDE w:val="0"/>
               <w:autoSpaceDN w:val="0"/>
               <w:spacing w:after="0" w:line="240" w:lineRule="auto"/>
-              <w:jc w:val="both"/>
               <w:rPr>
                 <w:rFonts w:eastAsia="Times New Roman" w:cs="Times New Roman"/>
                 <w:sz w:val="20"/>
@@ -18608,9 +18372,6 @@
         </w:tc>
       </w:tr>
       <w:tr>
-        <w:trPr>
-          <w:trHeight w:val="700"/>
-        </w:trPr>
         <w:tc>
           <w:tcPr>
             <w:tcW w:w="2268" w:type="dxa"/>
@@ -18622,7 +18383,6 @@
               <w:autoSpaceDN w:val="0"/>
               <w:spacing w:before="120" w:after="0" w:line="240" w:lineRule="auto"/>
               <w:ind w:left="107"/>
-              <w:jc w:val="both"/>
               <w:rPr>
                 <w:rFonts w:eastAsia="Times New Roman" w:cs="Times New Roman"/>
                 <w:sz w:val="20"/>
@@ -18649,7 +18409,6 @@
               <w:autoSpaceDN w:val="0"/>
               <w:spacing w:before="120" w:after="0" w:line="240" w:lineRule="auto"/>
               <w:ind w:left="6" w:right="3"/>
-              <w:jc w:val="both"/>
               <w:rPr>
                 <w:rFonts w:eastAsia="Times New Roman" w:cs="Times New Roman"/>
                 <w:sz w:val="20"/>
@@ -18675,7 +18434,6 @@
               <w:autoSpaceDE w:val="0"/>
               <w:autoSpaceDN w:val="0"/>
               <w:spacing w:after="0" w:line="240" w:lineRule="auto"/>
-              <w:jc w:val="both"/>
               <w:rPr>
                 <w:rFonts w:eastAsia="Times New Roman" w:cs="Times New Roman"/>
                 <w:sz w:val="20"/>
@@ -18700,7 +18458,6 @@
               <w:autoSpaceDE w:val="0"/>
               <w:autoSpaceDN w:val="0"/>
               <w:spacing w:after="0" w:line="240" w:lineRule="auto"/>
-              <w:jc w:val="both"/>
               <w:rPr>
                 <w:rFonts w:eastAsia="Times New Roman" w:cs="Times New Roman"/>
                 <w:sz w:val="20"/>
@@ -18717,9 +18474,6 @@
         </w:tc>
       </w:tr>
       <w:tr>
-        <w:trPr>
-          <w:trHeight w:val="700"/>
-        </w:trPr>
         <w:tc>
           <w:tcPr>
             <w:tcW w:w="2268" w:type="dxa"/>
@@ -18731,7 +18485,6 @@
               <w:autoSpaceDN w:val="0"/>
               <w:spacing w:before="120" w:after="0" w:line="240" w:lineRule="auto"/>
               <w:ind w:left="107" w:right="361"/>
-              <w:jc w:val="both"/>
               <w:rPr>
                 <w:rFonts w:eastAsia="Times New Roman" w:cs="Times New Roman"/>
                 <w:sz w:val="20"/>
@@ -18772,7 +18525,6 @@
               <w:autoSpaceDN w:val="0"/>
               <w:spacing w:before="120" w:after="0" w:line="240" w:lineRule="auto"/>
               <w:ind w:left="6" w:right="3"/>
-              <w:jc w:val="both"/>
               <w:rPr>
                 <w:rFonts w:eastAsia="Times New Roman" w:cs="Times New Roman"/>
                 <w:sz w:val="20"/>
@@ -18798,7 +18550,6 @@
               <w:autoSpaceDE w:val="0"/>
               <w:autoSpaceDN w:val="0"/>
               <w:spacing w:after="0" w:line="240" w:lineRule="auto"/>
-              <w:jc w:val="both"/>
               <w:rPr>
                 <w:rFonts w:eastAsia="Times New Roman" w:cs="Times New Roman"/>
                 <w:sz w:val="20"/>
@@ -18823,7 +18574,6 @@
               <w:autoSpaceDE w:val="0"/>
               <w:autoSpaceDN w:val="0"/>
               <w:spacing w:after="0" w:line="240" w:lineRule="auto"/>
-              <w:jc w:val="both"/>
               <w:rPr>
                 <w:rFonts w:eastAsia="Times New Roman" w:cs="Times New Roman"/>
                 <w:sz w:val="20"/>
@@ -18840,9 +18590,6 @@
         </w:tc>
       </w:tr>
       <w:tr>
-        <w:trPr>
-          <w:trHeight w:val="470"/>
-        </w:trPr>
         <w:tc>
           <w:tcPr>
             <w:tcW w:w="2268" w:type="dxa"/>
@@ -18854,7 +18601,6 @@
               <w:autoSpaceDN w:val="0"/>
               <w:spacing w:before="120" w:after="0" w:line="240" w:lineRule="auto"/>
               <w:ind w:left="107"/>
-              <w:jc w:val="both"/>
               <w:rPr>
                 <w:rFonts w:eastAsia="Times New Roman" w:cs="Times New Roman"/>
                 <w:sz w:val="20"/>
@@ -18881,7 +18627,6 @@
               <w:autoSpaceDN w:val="0"/>
               <w:spacing w:before="120" w:after="0" w:line="240" w:lineRule="auto"/>
               <w:ind w:left="6" w:right="3"/>
-              <w:jc w:val="both"/>
               <w:rPr>
                 <w:rFonts w:eastAsia="Times New Roman" w:cs="Times New Roman"/>
                 <w:sz w:val="20"/>
@@ -18907,7 +18652,6 @@
               <w:autoSpaceDE w:val="0"/>
               <w:autoSpaceDN w:val="0"/>
               <w:spacing w:after="0" w:line="240" w:lineRule="auto"/>
-              <w:jc w:val="both"/>
               <w:rPr>
                 <w:rFonts w:eastAsia="Times New Roman" w:cs="Times New Roman"/>
                 <w:sz w:val="20"/>
@@ -18932,7 +18676,6 @@
               <w:autoSpaceDE w:val="0"/>
               <w:autoSpaceDN w:val="0"/>
               <w:spacing w:after="0" w:line="240" w:lineRule="auto"/>
-              <w:jc w:val="both"/>
               <w:rPr>
                 <w:rFonts w:eastAsia="Times New Roman" w:cs="Times New Roman"/>
                 <w:sz w:val="20"/>
@@ -18949,9 +18692,6 @@
         </w:tc>
       </w:tr>
       <w:tr>
-        <w:trPr>
-          <w:trHeight w:val="469"/>
-        </w:trPr>
         <w:tc>
           <w:tcPr>
             <w:tcW w:w="9467" w:type="dxa"/>
@@ -18967,7 +18707,6 @@
               <w:autoSpaceDN w:val="0"/>
               <w:spacing w:before="120" w:after="0" w:line="240" w:lineRule="auto"/>
               <w:ind w:left="107"/>
-              <w:jc w:val="both"/>
               <w:rPr>
                 <w:rFonts w:eastAsia="Times New Roman" w:cs="Times New Roman"/>
                 <w:sz w:val="20"/>

</xml_diff>

<commit_message>
docs: publish updated Word report and PDF export
</commit_message>
<xml_diff>
--- a/Laporan Big Data Analytics - 2702751284.docx
+++ b/Laporan Big Data Analytics - 2702751284.docx
@@ -17892,6 +17892,75 @@
           <w:szCs w:val="20"/>
         </w:rPr>
       </w:pPr>
+      <w:r>
+        <w:rPr>
+          <w:noProof/>
+        </w:rPr>
+        <w:drawing>
+          <wp:anchor distT="0" distB="0" distL="114300" distR="114300" simplePos="0" relativeHeight="251662848" behindDoc="0" locked="0" layoutInCell="1" allowOverlap="1" wp14:anchorId="7FBD9ACE" wp14:editId="55DAEC82">
+            <wp:simplePos x="0" y="0"/>
+            <wp:positionH relativeFrom="column">
+              <wp:posOffset>-24765</wp:posOffset>
+            </wp:positionH>
+            <wp:positionV relativeFrom="paragraph">
+              <wp:posOffset>2873375</wp:posOffset>
+            </wp:positionV>
+            <wp:extent cx="1311910" cy="2324735"/>
+            <wp:effectExtent l="0" t="0" r="0" b="0"/>
+            <wp:wrapNone/>
+            <wp:docPr id="1991745812" name="Picture 1"/>
+            <wp:cNvGraphicFramePr>
+              <a:graphicFrameLocks xmlns:a="http://schemas.openxmlformats.org/drawingml/2006/main" noChangeAspect="1"/>
+            </wp:cNvGraphicFramePr>
+            <a:graphic xmlns:a="http://schemas.openxmlformats.org/drawingml/2006/main">
+              <a:graphicData uri="http://schemas.openxmlformats.org/drawingml/2006/picture">
+                <pic:pic xmlns:pic="http://schemas.openxmlformats.org/drawingml/2006/picture">
+                  <pic:nvPicPr>
+                    <pic:cNvPr id="1991745812" name="Picture 1991745812"/>
+                    <pic:cNvPicPr/>
+                  </pic:nvPicPr>
+                  <pic:blipFill>
+                    <a:blip r:embed="rId14" cstate="print">
+                      <a:extLst>
+                        <a:ext uri="{BEBA8EAE-BF5A-486C-A8C5-ECC9F3942E4B}">
+                          <a14:imgProps xmlns:a14="http://schemas.microsoft.com/office/drawing/2010/main">
+                            <a14:imgLayer r:embed="rId15">
+                              <a14:imgEffect>
+                                <a14:backgroundRemoval t="10000" b="90000" l="10000" r="90000"/>
+                              </a14:imgEffect>
+                            </a14:imgLayer>
+                          </a14:imgProps>
+                        </a:ext>
+                        <a:ext uri="{28A0092B-C50C-407E-A947-70E740481C1C}">
+                          <a14:useLocalDpi xmlns:a14="http://schemas.microsoft.com/office/drawing/2010/main" val="0"/>
+                        </a:ext>
+                      </a:extLst>
+                    </a:blip>
+                    <a:stretch>
+                      <a:fillRect/>
+                    </a:stretch>
+                  </pic:blipFill>
+                  <pic:spPr>
+                    <a:xfrm>
+                      <a:off x="0" y="0"/>
+                      <a:ext cx="1311910" cy="2324735"/>
+                    </a:xfrm>
+                    <a:prstGeom prst="rect">
+                      <a:avLst/>
+                    </a:prstGeom>
+                  </pic:spPr>
+                </pic:pic>
+              </a:graphicData>
+            </a:graphic>
+            <wp14:sizeRelH relativeFrom="page">
+              <wp14:pctWidth>0</wp14:pctWidth>
+            </wp14:sizeRelH>
+            <wp14:sizeRelV relativeFrom="page">
+              <wp14:pctHeight>0</wp14:pctHeight>
+            </wp14:sizeRelV>
+          </wp:anchor>
+        </w:drawing>
+      </w:r>
     </w:p>
     <w:tbl>
       <w:tblPr>
@@ -19348,7 +19417,6 @@
           <w:szCs w:val="20"/>
         </w:rPr>
       </w:pPr>
-      <w:commentRangeStart w:id="69"/>
       <w:r>
         <w:rPr>
           <w:rFonts w:eastAsia="Times New Roman" w:cs="Times New Roman"/>
@@ -19401,17 +19469,6 @@
           <w:szCs w:val="20"/>
         </w:rPr>
         <w:t>Student ID: 2702751284</w:t>
-      </w:r>
-      <w:commentRangeEnd w:id="69"/>
-      <w:r>
-        <w:rPr>
-          <w:rStyle w:val="CommentReference"/>
-          <w:rFonts w:eastAsia="Times New Roman" w:cs="Times New Roman"/>
-          <w:i/>
-          <w:sz w:val="20"/>
-          <w:szCs w:val="20"/>
-        </w:rPr>
-        <w:commentReference w:id="69"/>
       </w:r>
     </w:p>
     <w:p>
@@ -19432,7 +19489,7 @@
       </w:pPr>
     </w:p>
     <w:sectPr>
-      <w:headerReference w:type="default" r:id="rId18"/>
+      <w:headerReference w:type="default" r:id="rId16"/>
       <w:pgSz w:w="11907" w:h="16840" w:code="9"/>
       <w:pgMar w:top="1134" w:right="1134" w:bottom="1134" w:left="1134" w:header="720" w:footer="720" w:gutter="0"/>
       <w:pgNumType w:start="1"/>
@@ -19441,45 +19498,6 @@
     </w:sectPr>
   </w:body>
 </w:document>
-</file>
-
-<file path=word/comments.xml><?xml version="1.0" encoding="utf-8"?>
-<w:comments xmlns:wpc="http://schemas.microsoft.com/office/word/2010/wordprocessingCanvas" xmlns:cx="http://schemas.microsoft.com/office/drawing/2014/chartex" xmlns:cx1="http://schemas.microsoft.com/office/drawing/2015/9/8/chartex" xmlns:cx2="http://schemas.microsoft.com/office/drawing/2015/10/21/chartex" xmlns:cx3="http://schemas.microsoft.com/office/drawing/2016/5/9/chartex" xmlns:cx4="http://schemas.microsoft.com/office/drawing/2016/5/10/chartex" xmlns:cx5="http://schemas.microsoft.com/office/drawing/2016/5/11/chartex" xmlns:cx6="http://schemas.microsoft.com/office/drawing/2016/5/12/chartex" xmlns:cx7="http://schemas.microsoft.com/office/drawing/2016/5/13/chartex" xmlns:cx8="http://schemas.microsoft.com/office/drawing/2016/5/14/chartex" xmlns:mc="http://schemas.openxmlformats.org/markup-compatibility/2006" xmlns:aink="http://schemas.microsoft.com/office/drawing/2016/ink" xmlns:am3d="http://schemas.microsoft.com/office/drawing/2017/model3d" xmlns:o="urn:schemas-microsoft-com:office:office" xmlns:oel="http://schemas.microsoft.com/office/2019/extlst" xmlns:r="http://schemas.openxmlformats.org/officeDocument/2006/relationships" xmlns:m="http://schemas.openxmlformats.org/officeDocument/2006/math" xmlns:v="urn:schemas-microsoft-com:vml" xmlns:wp14="http://schemas.microsoft.com/office/word/2010/wordprocessingDrawing" xmlns:wp="http://schemas.openxmlformats.org/drawingml/2006/wordprocessingDrawing" xmlns:w10="urn:schemas-microsoft-com:office:word" xmlns:w="http://schemas.openxmlformats.org/wordprocessingml/2006/main" xmlns:w14="http://schemas.microsoft.com/office/word/2010/wordml" xmlns:w15="http://schemas.microsoft.com/office/word/2012/wordml" xmlns:w16cex="http://schemas.microsoft.com/office/word/2018/wordml/cex" xmlns:w16cid="http://schemas.microsoft.com/office/word/2016/wordml/cid" xmlns:w16="http://schemas.microsoft.com/office/word/2018/wordml" xmlns:w16du="http://schemas.microsoft.com/office/word/2023/wordml/word16du" xmlns:w16sdtdh="http://schemas.microsoft.com/office/word/2020/wordml/sdtdatahash" xmlns:w16sdtfl="http://schemas.microsoft.com/office/word/2024/wordml/sdtformatlock" xmlns:w16se="http://schemas.microsoft.com/office/word/2015/wordml/symex" xmlns:wpg="http://schemas.microsoft.com/office/word/2010/wordprocessingGroup" xmlns:wpi="http://schemas.microsoft.com/office/word/2010/wordprocessingInk" xmlns:wne="http://schemas.microsoft.com/office/word/2006/wordml" xmlns:wps="http://schemas.microsoft.com/office/word/2010/wordprocessingShape" mc:Ignorable="w14 w15 w16se w16cid w16 w16cex w16sdtdh w16sdtfl w16du wp14">
-  <w:comment w:id="69" w:author="Yanlis Alim Sang Putra Lase" w:date="2026-09-21T16:23:00Z" w:initials="YL">
-    <w:p>
-      <w:pPr>
-        <w:pStyle w:val="CommentText"/>
-      </w:pPr>
-      <w:r>
-        <w:rPr>
-          <w:rStyle w:val="CommentReference"/>
-        </w:rPr>
-        <w:annotationRef/>
-      </w:r>
-      <w:r>
-        <w:t>Kalau sudah final, jangan lupa tanda tangan dan ubah tanggal</w:t>
-      </w:r>
-    </w:p>
-  </w:comment>
-</w:comments>
-</file>
-
-<file path=word/commentsExtended.xml><?xml version="1.0" encoding="utf-8"?>
-<w15:commentsEx xmlns:wpc="http://schemas.microsoft.com/office/word/2010/wordprocessingCanvas" xmlns:cx="http://schemas.microsoft.com/office/drawing/2014/chartex" xmlns:cx1="http://schemas.microsoft.com/office/drawing/2015/9/8/chartex" xmlns:cx2="http://schemas.microsoft.com/office/drawing/2015/10/21/chartex" xmlns:cx3="http://schemas.microsoft.com/office/drawing/2016/5/9/chartex" xmlns:cx4="http://schemas.microsoft.com/office/drawing/2016/5/10/chartex" xmlns:cx5="http://schemas.microsoft.com/office/drawing/2016/5/11/chartex" xmlns:cx6="http://schemas.microsoft.com/office/drawing/2016/5/12/chartex" xmlns:cx7="http://schemas.microsoft.com/office/drawing/2016/5/13/chartex" xmlns:cx8="http://schemas.microsoft.com/office/drawing/2016/5/14/chartex" xmlns:mc="http://schemas.openxmlformats.org/markup-compatibility/2006" xmlns:aink="http://schemas.microsoft.com/office/drawing/2016/ink" xmlns:am3d="http://schemas.microsoft.com/office/drawing/2017/model3d" xmlns:o="urn:schemas-microsoft-com:office:office" xmlns:oel="http://schemas.microsoft.com/office/2019/extlst" xmlns:r="http://schemas.openxmlformats.org/officeDocument/2006/relationships" xmlns:m="http://schemas.openxmlformats.org/officeDocument/2006/math" xmlns:v="urn:schemas-microsoft-com:vml" xmlns:wp14="http://schemas.microsoft.com/office/word/2010/wordprocessingDrawing" xmlns:wp="http://schemas.openxmlformats.org/drawingml/2006/wordprocessingDrawing" xmlns:w10="urn:schemas-microsoft-com:office:word" xmlns:w="http://schemas.openxmlformats.org/wordprocessingml/2006/main" xmlns:w14="http://schemas.microsoft.com/office/word/2010/wordml" xmlns:w15="http://schemas.microsoft.com/office/word/2012/wordml" xmlns:w16cex="http://schemas.microsoft.com/office/word/2018/wordml/cex" xmlns:w16cid="http://schemas.microsoft.com/office/word/2016/wordml/cid" xmlns:w16="http://schemas.microsoft.com/office/word/2018/wordml" xmlns:w16du="http://schemas.microsoft.com/office/word/2023/wordml/word16du" xmlns:w16sdtdh="http://schemas.microsoft.com/office/word/2020/wordml/sdtdatahash" xmlns:w16sdtfl="http://schemas.microsoft.com/office/word/2024/wordml/sdtformatlock" xmlns:w16se="http://schemas.microsoft.com/office/word/2015/wordml/symex" xmlns:wpg="http://schemas.microsoft.com/office/word/2010/wordprocessingGroup" xmlns:wpi="http://schemas.microsoft.com/office/word/2010/wordprocessingInk" xmlns:wne="http://schemas.microsoft.com/office/word/2006/wordml" xmlns:wps="http://schemas.microsoft.com/office/word/2010/wordprocessingShape" mc:Ignorable="w14 w15 w16se w16cid w16 w16cex w16sdtdh w16sdtfl w16du wp14">
-  <w15:commentEx w15:paraId="2EE11558" w15:done="0"/>
-</w15:commentsEx>
-</file>
-
-<file path=word/commentsExtensible.xml><?xml version="1.0" encoding="utf-8"?>
-<w16cex:commentsExtensible xmlns:wpc="http://schemas.microsoft.com/office/word/2010/wordprocessingCanvas" xmlns:cx="http://schemas.microsoft.com/office/drawing/2014/chartex" xmlns:cx1="http://schemas.microsoft.com/office/drawing/2015/9/8/chartex" xmlns:cx2="http://schemas.microsoft.com/office/drawing/2015/10/21/chartex" xmlns:cx3="http://schemas.microsoft.com/office/drawing/2016/5/9/chartex" xmlns:cx4="http://schemas.microsoft.com/office/drawing/2016/5/10/chartex" xmlns:cx5="http://schemas.microsoft.com/office/drawing/2016/5/11/chartex" xmlns:cx6="http://schemas.microsoft.com/office/drawing/2016/5/12/chartex" xmlns:cx7="http://schemas.microsoft.com/office/drawing/2016/5/13/chartex" xmlns:cx8="http://schemas.microsoft.com/office/drawing/2016/5/14/chartex" xmlns:cr="http://schemas.microsoft.com/office/comments/2020/reactions" xmlns:mc="http://schemas.openxmlformats.org/markup-compatibility/2006" xmlns:aink="http://schemas.microsoft.com/office/drawing/2016/ink" xmlns:am3d="http://schemas.microsoft.com/office/drawing/2017/model3d" xmlns:o="urn:schemas-microsoft-com:office:office" xmlns:oel="http://schemas.microsoft.com/office/2019/extlst" xmlns:r="http://schemas.openxmlformats.org/officeDocument/2006/relationships" xmlns:m="http://schemas.openxmlformats.org/officeDocument/2006/math" xmlns:v="urn:schemas-microsoft-com:vml" xmlns:wp14="http://schemas.microsoft.com/office/word/2010/wordprocessingDrawing" xmlns:wp="http://schemas.openxmlformats.org/drawingml/2006/wordprocessingDrawing" xmlns:w10="urn:schemas-microsoft-com:office:word" xmlns:w="http://schemas.openxmlformats.org/wordprocessingml/2006/main" xmlns:w14="http://schemas.microsoft.com/office/word/2010/wordml" xmlns:w15="http://schemas.microsoft.com/office/word/2012/wordml" xmlns:w16cex="http://schemas.microsoft.com/office/word/2018/wordml/cex" xmlns:w16cid="http://schemas.microsoft.com/office/word/2016/wordml/cid" xmlns:w16="http://schemas.microsoft.com/office/word/2018/wordml" xmlns:w16du="http://schemas.microsoft.com/office/word/2023/wordml/word16du" xmlns:w16sdtdh="http://schemas.microsoft.com/office/word/2020/wordml/sdtdatahash" xmlns:w16sdtfl="http://schemas.microsoft.com/office/word/2024/wordml/sdtformatlock" xmlns:w16se="http://schemas.microsoft.com/office/word/2015/wordml/symex" xmlns:wpg="http://schemas.microsoft.com/office/word/2010/wordprocessingGroup" xmlns:wpi="http://schemas.microsoft.com/office/word/2010/wordprocessingInk" xmlns:wne="http://schemas.microsoft.com/office/word/2006/wordml" xmlns:wps="http://schemas.microsoft.com/office/word/2010/wordprocessingShape" mc:Ignorable="w14 w15 w16se w16cid w16 w16cex w16sdtdh w16sdtfl cr w16du wp14">
-  <w16cex:commentExtensible w16cex:durableId="2D165D1A" w16cex:dateUtc="2026-09-21T09:23:00Z"/>
-</w16cex:commentsExtensible>
-</file>
-
-<file path=word/commentsIds.xml><?xml version="1.0" encoding="utf-8"?>
-<w16cid:commentsIds xmlns:wpc="http://schemas.microsoft.com/office/word/2010/wordprocessingCanvas" xmlns:cx="http://schemas.microsoft.com/office/drawing/2014/chartex" xmlns:cx1="http://schemas.microsoft.com/office/drawing/2015/9/8/chartex" xmlns:cx2="http://schemas.microsoft.com/office/drawing/2015/10/21/chartex" xmlns:cx3="http://schemas.microsoft.com/office/drawing/2016/5/9/chartex" xmlns:cx4="http://schemas.microsoft.com/office/drawing/2016/5/10/chartex" xmlns:cx5="http://schemas.microsoft.com/office/drawing/2016/5/11/chartex" xmlns:cx6="http://schemas.microsoft.com/office/drawing/2016/5/12/chartex" xmlns:cx7="http://schemas.microsoft.com/office/drawing/2016/5/13/chartex" xmlns:cx8="http://schemas.microsoft.com/office/drawing/2016/5/14/chartex" xmlns:mc="http://schemas.openxmlformats.org/markup-compatibility/2006" xmlns:aink="http://schemas.microsoft.com/office/drawing/2016/ink" xmlns:am3d="http://schemas.microsoft.com/office/drawing/2017/model3d" xmlns:o="urn:schemas-microsoft-com:office:office" xmlns:oel="http://schemas.microsoft.com/office/2019/extlst" xmlns:r="http://schemas.openxmlformats.org/officeDocument/2006/relationships" xmlns:m="http://schemas.openxmlformats.org/officeDocument/2006/math" xmlns:v="urn:schemas-microsoft-com:vml" xmlns:wp14="http://schemas.microsoft.com/office/word/2010/wordprocessingDrawing" xmlns:wp="http://schemas.openxmlformats.org/drawingml/2006/wordprocessingDrawing" xmlns:w10="urn:schemas-microsoft-com:office:word" xmlns:w="http://schemas.openxmlformats.org/wordprocessingml/2006/main" xmlns:w14="http://schemas.microsoft.com/office/word/2010/wordml" xmlns:w15="http://schemas.microsoft.com/office/word/2012/wordml" xmlns:w16cex="http://schemas.microsoft.com/office/word/2018/wordml/cex" xmlns:w16cid="http://schemas.microsoft.com/office/word/2016/wordml/cid" xmlns:w16="http://schemas.microsoft.com/office/word/2018/wordml" xmlns:w16du="http://schemas.microsoft.com/office/word/2023/wordml/word16du" xmlns:w16sdtdh="http://schemas.microsoft.com/office/word/2020/wordml/sdtdatahash" xmlns:w16sdtfl="http://schemas.microsoft.com/office/word/2024/wordml/sdtformatlock" xmlns:w16se="http://schemas.microsoft.com/office/word/2015/wordml/symex" xmlns:wpg="http://schemas.microsoft.com/office/word/2010/wordprocessingGroup" xmlns:wpi="http://schemas.microsoft.com/office/word/2010/wordprocessingInk" xmlns:wne="http://schemas.microsoft.com/office/word/2006/wordml" xmlns:wps="http://schemas.microsoft.com/office/word/2010/wordprocessingShape" mc:Ignorable="w14 w15 w16se w16cid w16 w16cex w16sdtdh w16sdtfl w16du wp14">
-  <w16cid:commentId w16cid:paraId="2EE11558" w16cid:durableId="2D165D1A"/>
-</w16cid:commentsIds>
 </file>
 
 <file path=word/endnotes.xml><?xml version="1.0" encoding="utf-8"?>
@@ -21054,14 +21072,6 @@
   </w:num>
   <w:numIdMacAtCleanup w:val="11"/>
 </w:numbering>
-</file>
-
-<file path=word/people.xml><?xml version="1.0" encoding="utf-8"?>
-<w15:people xmlns:wpc="http://schemas.microsoft.com/office/word/2010/wordprocessingCanvas" xmlns:cx="http://schemas.microsoft.com/office/drawing/2014/chartex" xmlns:cx1="http://schemas.microsoft.com/office/drawing/2015/9/8/chartex" xmlns:cx2="http://schemas.microsoft.com/office/drawing/2015/10/21/chartex" xmlns:cx3="http://schemas.microsoft.com/office/drawing/2016/5/9/chartex" xmlns:cx4="http://schemas.microsoft.com/office/drawing/2016/5/10/chartex" xmlns:cx5="http://schemas.microsoft.com/office/drawing/2016/5/11/chartex" xmlns:cx6="http://schemas.microsoft.com/office/drawing/2016/5/12/chartex" xmlns:cx7="http://schemas.microsoft.com/office/drawing/2016/5/13/chartex" xmlns:cx8="http://schemas.microsoft.com/office/drawing/2016/5/14/chartex" xmlns:mc="http://schemas.openxmlformats.org/markup-compatibility/2006" xmlns:aink="http://schemas.microsoft.com/office/drawing/2016/ink" xmlns:am3d="http://schemas.microsoft.com/office/drawing/2017/model3d" xmlns:o="urn:schemas-microsoft-com:office:office" xmlns:oel="http://schemas.microsoft.com/office/2019/extlst" xmlns:r="http://schemas.openxmlformats.org/officeDocument/2006/relationships" xmlns:m="http://schemas.openxmlformats.org/officeDocument/2006/math" xmlns:v="urn:schemas-microsoft-com:vml" xmlns:wp14="http://schemas.microsoft.com/office/word/2010/wordprocessingDrawing" xmlns:wp="http://schemas.openxmlformats.org/drawingml/2006/wordprocessingDrawing" xmlns:w10="urn:schemas-microsoft-com:office:word" xmlns:w="http://schemas.openxmlformats.org/wordprocessingml/2006/main" xmlns:w14="http://schemas.microsoft.com/office/word/2010/wordml" xmlns:w15="http://schemas.microsoft.com/office/word/2012/wordml" xmlns:w16cex="http://schemas.microsoft.com/office/word/2018/wordml/cex" xmlns:w16cid="http://schemas.microsoft.com/office/word/2016/wordml/cid" xmlns:w16="http://schemas.microsoft.com/office/word/2018/wordml" xmlns:w16du="http://schemas.microsoft.com/office/word/2023/wordml/word16du" xmlns:w16sdtdh="http://schemas.microsoft.com/office/word/2020/wordml/sdtdatahash" xmlns:w16sdtfl="http://schemas.microsoft.com/office/word/2024/wordml/sdtformatlock" xmlns:w16se="http://schemas.microsoft.com/office/word/2015/wordml/symex" xmlns:wpg="http://schemas.microsoft.com/office/word/2010/wordprocessingGroup" xmlns:wpi="http://schemas.microsoft.com/office/word/2010/wordprocessingInk" xmlns:wne="http://schemas.microsoft.com/office/word/2006/wordml" xmlns:wps="http://schemas.microsoft.com/office/word/2010/wordprocessingShape" mc:Ignorable="w14 w15 w16se w16cid w16 w16cex w16sdtdh w16sdtfl w16du wp14">
-  <w15:person w15:author="Yanlis Alim Sang Putra Lase">
-    <w15:presenceInfo w15:providerId="AD" w15:userId="S::yanlis.lase@binus.edu::b85403fe-3c52-4013-bfd6-39a0841a9c00"/>
-  </w15:person>
-</w15:people>
 </file>
 
 <file path=word/styles.xml><?xml version="1.0" encoding="utf-8"?>

</xml_diff>